<commit_message>
- compacted utterances - helper dialog to quickly highlight elements
</commit_message>
<xml_diff>
--- a/doc/doku.docx
+++ b/doc/doku.docx
@@ -1,6 +1,6 @@
 
 <file path=word/document.xml><?xml version="1.0" encoding="utf-8"?>
-<w:document xmlns:wpc="http://schemas.microsoft.com/office/word/2010/wordprocessingCanvas" xmlns:cx="http://schemas.microsoft.com/office/drawing/2014/chartex" xmlns:cx1="http://schemas.microsoft.com/office/drawing/2015/9/8/chartex" xmlns:cx2="http://schemas.microsoft.com/office/drawing/2015/10/21/chartex" xmlns:cx3="http://schemas.microsoft.com/office/drawing/2016/5/9/chartex" xmlns:cx4="http://schemas.microsoft.com/office/drawing/2016/5/10/chartex" xmlns:cx5="http://schemas.microsoft.com/office/drawing/2016/5/11/chartex" xmlns:cx6="http://schemas.microsoft.com/office/drawing/2016/5/12/chartex" xmlns:cx7="http://schemas.microsoft.com/office/drawing/2016/5/13/chartex" xmlns:cx8="http://schemas.microsoft.com/office/drawing/2016/5/14/chartex" xmlns:mc="http://schemas.openxmlformats.org/markup-compatibility/2006" xmlns:aink="http://schemas.microsoft.com/office/drawing/2016/ink" xmlns:am3d="http://schemas.microsoft.com/office/drawing/2017/model3d" xmlns:o="urn:schemas-microsoft-com:office:office" xmlns:oel="http://schemas.microsoft.com/office/2019/extlst" xmlns:r="http://schemas.openxmlformats.org/officeDocument/2006/relationships" xmlns:m="http://schemas.openxmlformats.org/officeDocument/2006/math" xmlns:v="urn:schemas-microsoft-com:vml" xmlns:wp14="http://schemas.microsoft.com/office/word/2010/wordprocessingDrawing" xmlns:wp="http://schemas.openxmlformats.org/drawingml/2006/wordprocessingDrawing" xmlns:w10="urn:schemas-microsoft-com:office:word" xmlns:w="http://schemas.openxmlformats.org/wordprocessingml/2006/main" xmlns:w14="http://schemas.microsoft.com/office/word/2010/wordml" xmlns:w15="http://schemas.microsoft.com/office/word/2012/wordml" xmlns:w16cex="http://schemas.microsoft.com/office/word/2018/wordml/cex" xmlns:w16cid="http://schemas.microsoft.com/office/word/2016/wordml/cid" xmlns:w16="http://schemas.microsoft.com/office/word/2018/wordml" xmlns:w16sdtdh="http://schemas.microsoft.com/office/word/2020/wordml/sdtdatahash" xmlns:w16se="http://schemas.microsoft.com/office/word/2015/wordml/symex" xmlns:wpg="http://schemas.microsoft.com/office/word/2010/wordprocessingGroup" xmlns:wpi="http://schemas.microsoft.com/office/word/2010/wordprocessingInk" xmlns:wne="http://schemas.microsoft.com/office/word/2006/wordml" xmlns:wps="http://schemas.microsoft.com/office/word/2010/wordprocessingShape" mc:Ignorable="w14 w15 w16se w16cid w16 w16cex w16sdtdh wp14">
+<w:document xmlns:wpc="http://schemas.microsoft.com/office/word/2010/wordprocessingCanvas" xmlns:cx="http://schemas.microsoft.com/office/drawing/2014/chartex" xmlns:cx1="http://schemas.microsoft.com/office/drawing/2015/9/8/chartex" xmlns:cx2="http://schemas.microsoft.com/office/drawing/2015/10/21/chartex" xmlns:cx3="http://schemas.microsoft.com/office/drawing/2016/5/9/chartex" xmlns:cx4="http://schemas.microsoft.com/office/drawing/2016/5/10/chartex" xmlns:cx5="http://schemas.microsoft.com/office/drawing/2016/5/11/chartex" xmlns:cx6="http://schemas.microsoft.com/office/drawing/2016/5/12/chartex" xmlns:cx7="http://schemas.microsoft.com/office/drawing/2016/5/13/chartex" xmlns:cx8="http://schemas.microsoft.com/office/drawing/2016/5/14/chartex" xmlns:mc="http://schemas.openxmlformats.org/markup-compatibility/2006" xmlns:aink="http://schemas.microsoft.com/office/drawing/2016/ink" xmlns:am3d="http://schemas.microsoft.com/office/drawing/2017/model3d" xmlns:o="urn:schemas-microsoft-com:office:office" xmlns:oel="http://schemas.microsoft.com/office/2019/extlst" xmlns:r="http://schemas.openxmlformats.org/officeDocument/2006/relationships" xmlns:m="http://schemas.openxmlformats.org/officeDocument/2006/math" xmlns:v="urn:schemas-microsoft-com:vml" xmlns:wp14="http://schemas.microsoft.com/office/word/2010/wordprocessingDrawing" xmlns:wp="http://schemas.openxmlformats.org/drawingml/2006/wordprocessingDrawing" xmlns:w10="urn:schemas-microsoft-com:office:word" xmlns:w="http://schemas.openxmlformats.org/wordprocessingml/2006/main" xmlns:w14="http://schemas.microsoft.com/office/word/2010/wordml" xmlns:w15="http://schemas.microsoft.com/office/word/2012/wordml" xmlns:w16cex="http://schemas.microsoft.com/office/word/2018/wordml/cex" xmlns:w16cid="http://schemas.microsoft.com/office/word/2016/wordml/cid" xmlns:w16="http://schemas.microsoft.com/office/word/2018/wordml" xmlns:w16du="http://schemas.microsoft.com/office/word/2023/wordml/word16du" xmlns:w16sdtdh="http://schemas.microsoft.com/office/word/2020/wordml/sdtdatahash" xmlns:w16sdtfl="http://schemas.microsoft.com/office/word/2024/wordml/sdtformatlock" xmlns:w16se="http://schemas.microsoft.com/office/word/2015/wordml/symex" xmlns:wpg="http://schemas.microsoft.com/office/word/2010/wordprocessingGroup" xmlns:wpi="http://schemas.microsoft.com/office/word/2010/wordprocessingInk" xmlns:wne="http://schemas.microsoft.com/office/word/2006/wordml" xmlns:wps="http://schemas.microsoft.com/office/word/2010/wordprocessingShape" mc:Ignorable="w14 w15 w16se w16cid w16 w16cex w16sdtdh w16sdtfl w16du wp14">
   <w:body>
     <w:p>
       <w:pPr>
@@ -99,14 +99,7 @@
       </w:r>
       <w:r>
         <w:br/>
-      </w:r>
-      <w:proofErr w:type="gramStart"/>
-      <w:r>
-        <w:t>Hier</w:t>
-      </w:r>
-      <w:proofErr w:type="gramEnd"/>
-      <w:r>
-        <w:t xml:space="preserve"> werden alle UI Erweiterungen, wie z.B. Key-Handler oder </w:t>
+        <w:t xml:space="preserve">Hier werden alle UI Erweiterungen, wie z.B. Key-Handler oder </w:t>
       </w:r>
       <w:proofErr w:type="spellStart"/>
       <w:r>
@@ -775,15 +768,17 @@
       <w:tblPr>
         <w:tblStyle w:val="Listentabelle4Akzent1"/>
         <w:tblW w:w="0" w:type="auto"/>
+        <w:tblLayout w:type="fixed"/>
         <w:tblLook w:val="0420" w:firstRow="1" w:lastRow="0" w:firstColumn="0" w:lastColumn="0" w:noHBand="0" w:noVBand="1"/>
       </w:tblPr>
       <w:tblGrid>
         <w:gridCol w:w="399"/>
         <w:gridCol w:w="251"/>
         <w:gridCol w:w="1339"/>
-        <w:gridCol w:w="1856"/>
-        <w:gridCol w:w="545"/>
-        <w:gridCol w:w="777"/>
+        <w:gridCol w:w="1834"/>
+        <w:gridCol w:w="22"/>
+        <w:gridCol w:w="1253"/>
+        <w:gridCol w:w="69"/>
         <w:gridCol w:w="640"/>
         <w:gridCol w:w="3255"/>
       </w:tblGrid>
@@ -804,8 +799,7 @@
         </w:tc>
         <w:tc>
           <w:tcPr>
-            <w:tcW w:w="2401" w:type="dxa"/>
-            <w:gridSpan w:val="2"/>
+            <w:tcW w:w="1834" w:type="dxa"/>
           </w:tcPr>
           <w:p>
             <w:r>
@@ -815,8 +809,8 @@
         </w:tc>
         <w:tc>
           <w:tcPr>
-            <w:tcW w:w="1417" w:type="dxa"/>
-            <w:gridSpan w:val="2"/>
+            <w:tcW w:w="1984" w:type="dxa"/>
+            <w:gridSpan w:val="4"/>
           </w:tcPr>
           <w:p>
             <w:proofErr w:type="spellStart"/>
@@ -847,56 +841,43 @@
             <w:gridSpan w:val="3"/>
           </w:tcPr>
           <w:p>
-            <w:pPr>
-              <w:rPr>
-                <w:rStyle w:val="QuelltextZeichen"/>
-              </w:rPr>
-            </w:pPr>
-            <w:r>
-              <w:rPr>
-                <w:rStyle w:val="QuelltextZeichen"/>
-              </w:rPr>
-              <w:t>p</w:t>
-            </w:r>
-            <w:r>
-              <w:rPr>
-                <w:rStyle w:val="QuelltextZeichen"/>
-              </w:rPr>
-              <w:t>itch</w:t>
-            </w:r>
-          </w:p>
-        </w:tc>
-        <w:tc>
-          <w:tcPr>
-            <w:tcW w:w="1856" w:type="dxa"/>
-          </w:tcPr>
-          <w:p>
-            <w:proofErr w:type="spellStart"/>
-            <w:r>
-              <w:t>float</w:t>
-            </w:r>
-            <w:proofErr w:type="spellEnd"/>
-          </w:p>
-        </w:tc>
-        <w:tc>
-          <w:tcPr>
-            <w:tcW w:w="1322" w:type="dxa"/>
-            <w:gridSpan w:val="2"/>
-          </w:tcPr>
-          <w:p>
-            <w:r>
-              <w:t>0,8</w:t>
-            </w:r>
-          </w:p>
-        </w:tc>
-        <w:tc>
-          <w:tcPr>
-            <w:tcW w:w="3895" w:type="dxa"/>
-            <w:gridSpan w:val="2"/>
-          </w:tcPr>
-          <w:p>
-            <w:r>
-              <w:t>Tonhöhe</w:t>
+            <w:r>
+              <w:rPr>
+                <w:rStyle w:val="QuelltextZeichen"/>
+              </w:rPr>
+              <w:t>priority</w:t>
+            </w:r>
+          </w:p>
+        </w:tc>
+        <w:tc>
+          <w:tcPr>
+            <w:tcW w:w="1834" w:type="dxa"/>
+          </w:tcPr>
+          <w:p>
+            <w:r>
+              <w:t>Integer</w:t>
+            </w:r>
+          </w:p>
+        </w:tc>
+        <w:tc>
+          <w:tcPr>
+            <w:tcW w:w="1275" w:type="dxa"/>
+            <w:gridSpan w:val="2"/>
+          </w:tcPr>
+          <w:p>
+            <w:r>
+              <w:t>10</w:t>
+            </w:r>
+          </w:p>
+        </w:tc>
+        <w:tc>
+          <w:tcPr>
+            <w:tcW w:w="3964" w:type="dxa"/>
+            <w:gridSpan w:val="3"/>
+          </w:tcPr>
+          <w:p>
+            <w:r>
+              <w:t xml:space="preserve">Auswertungsreihenfolge </w:t>
             </w:r>
           </w:p>
         </w:tc>
@@ -917,24 +898,25 @@
               <w:rPr>
                 <w:rStyle w:val="QuelltextZeichen"/>
               </w:rPr>
-              <w:t>r</w:t>
-            </w:r>
-            <w:r>
-              <w:rPr>
-                <w:rStyle w:val="QuelltextZeichen"/>
-              </w:rPr>
-              <w:t>ate</w:t>
+              <w:t>p</w:t>
+            </w:r>
+            <w:r>
+              <w:rPr>
+                <w:rStyle w:val="QuelltextZeichen"/>
+              </w:rPr>
+              <w:t>itch</w:t>
             </w:r>
           </w:p>
         </w:tc>
         <w:tc>
           <w:tcPr>
             <w:tcW w:w="1856" w:type="dxa"/>
+            <w:gridSpan w:val="2"/>
           </w:tcPr>
           <w:p>
             <w:proofErr w:type="spellStart"/>
             <w:r>
-              <w:t>Float</w:t>
+              <w:t>float</w:t>
             </w:r>
             <w:proofErr w:type="spellEnd"/>
           </w:p>
@@ -946,7 +928,7 @@
           </w:tcPr>
           <w:p>
             <w:r>
-              <w:t>1,35</w:t>
+              <w:t>0,8</w:t>
             </w:r>
           </w:p>
         </w:tc>
@@ -957,7 +939,7 @@
           </w:tcPr>
           <w:p>
             <w:r>
-              <w:t>Sprechgeschwindigkeit</w:t>
+              <w:t>Tonhöhe</w:t>
             </w:r>
           </w:p>
         </w:tc>
@@ -972,17 +954,29 @@
             <w:gridSpan w:val="3"/>
           </w:tcPr>
           <w:p>
-            <w:r>
-              <w:rPr>
-                <w:rStyle w:val="QuelltextZeichen"/>
-              </w:rPr>
-              <w:t>volume</w:t>
+            <w:pPr>
+              <w:rPr>
+                <w:rStyle w:val="QuelltextZeichen"/>
+              </w:rPr>
+            </w:pPr>
+            <w:r>
+              <w:rPr>
+                <w:rStyle w:val="QuelltextZeichen"/>
+              </w:rPr>
+              <w:t>r</w:t>
+            </w:r>
+            <w:r>
+              <w:rPr>
+                <w:rStyle w:val="QuelltextZeichen"/>
+              </w:rPr>
+              <w:t>ate</w:t>
             </w:r>
           </w:p>
         </w:tc>
         <w:tc>
           <w:tcPr>
             <w:tcW w:w="1856" w:type="dxa"/>
+            <w:gridSpan w:val="2"/>
           </w:tcPr>
           <w:p>
             <w:proofErr w:type="spellStart"/>
@@ -999,7 +993,7 @@
           </w:tcPr>
           <w:p>
             <w:r>
-              <w:t>0,8</w:t>
+              <w:t>1,35</w:t>
             </w:r>
           </w:p>
         </w:tc>
@@ -1010,7 +1004,7 @@
           </w:tcPr>
           <w:p>
             <w:r>
-              <w:t>Lautstärke</w:t>
+              <w:t>Sprechgeschwindigkeit</w:t>
             </w:r>
           </w:p>
         </w:tc>
@@ -1026,18 +1020,19 @@
               <w:rPr>
                 <w:rStyle w:val="QuelltextZeichen"/>
               </w:rPr>
-              <w:t>language</w:t>
+              <w:t>volume</w:t>
             </w:r>
           </w:p>
         </w:tc>
         <w:tc>
           <w:tcPr>
             <w:tcW w:w="1856" w:type="dxa"/>
+            <w:gridSpan w:val="2"/>
           </w:tcPr>
           <w:p>
             <w:proofErr w:type="spellStart"/>
             <w:r>
-              <w:t>string</w:t>
+              <w:t>Float</w:t>
             </w:r>
             <w:proofErr w:type="spellEnd"/>
           </w:p>
@@ -1049,7 +1044,7 @@
           </w:tcPr>
           <w:p>
             <w:r>
-              <w:t>de-DE</w:t>
+              <w:t>0,8</w:t>
             </w:r>
           </w:p>
         </w:tc>
@@ -1060,7 +1055,7 @@
           </w:tcPr>
           <w:p>
             <w:r>
-              <w:t>Sprache</w:t>
+              <w:t>Lautstärke</w:t>
             </w:r>
           </w:p>
         </w:tc>
@@ -1075,22 +1070,18 @@
             <w:gridSpan w:val="3"/>
           </w:tcPr>
           <w:p>
-            <w:pPr>
-              <w:rPr>
-                <w:rStyle w:val="QuelltextZeichen"/>
-              </w:rPr>
-            </w:pPr>
-            <w:r>
-              <w:rPr>
-                <w:rStyle w:val="QuelltextZeichen"/>
-              </w:rPr>
-              <w:t>prefix</w:t>
+            <w:r>
+              <w:rPr>
+                <w:rStyle w:val="QuelltextZeichen"/>
+              </w:rPr>
+              <w:t>language</w:t>
             </w:r>
           </w:p>
         </w:tc>
         <w:tc>
           <w:tcPr>
             <w:tcW w:w="1856" w:type="dxa"/>
+            <w:gridSpan w:val="2"/>
           </w:tcPr>
           <w:p>
             <w:proofErr w:type="spellStart"/>
@@ -1107,7 +1098,7 @@
           </w:tcPr>
           <w:p>
             <w:r>
-              <w:t>&lt;leer&gt;</w:t>
+              <w:t>de-DE</w:t>
             </w:r>
           </w:p>
         </w:tc>
@@ -1118,7 +1109,7 @@
           </w:tcPr>
           <w:p>
             <w:r>
-              <w:t>Vorangestellter Text</w:t>
+              <w:t>Sprache</w:t>
             </w:r>
           </w:p>
         </w:tc>
@@ -1133,32 +1124,20 @@
             <w:pPr>
               <w:rPr>
                 <w:rStyle w:val="QuelltextZeichen"/>
-                <w:lang w:val="en-US"/>
-              </w:rPr>
-            </w:pPr>
-            <w:r>
-              <w:rPr>
-                <w:rStyle w:val="QuelltextZeichen"/>
-              </w:rPr>
-              <w:t>suf</w:t>
-            </w:r>
-            <w:r>
-              <w:rPr>
-                <w:rStyle w:val="QuelltextZeichen"/>
-              </w:rPr>
-              <w:t>f</w:t>
-            </w:r>
-            <w:r>
-              <w:rPr>
-                <w:rStyle w:val="QuelltextZeichen"/>
-              </w:rPr>
-              <w:t>ix</w:t>
+              </w:rPr>
+            </w:pPr>
+            <w:r>
+              <w:rPr>
+                <w:rStyle w:val="QuelltextZeichen"/>
+              </w:rPr>
+              <w:t>prefix</w:t>
             </w:r>
           </w:p>
         </w:tc>
         <w:tc>
           <w:tcPr>
             <w:tcW w:w="1856" w:type="dxa"/>
+            <w:gridSpan w:val="2"/>
           </w:tcPr>
           <w:p>
             <w:proofErr w:type="spellStart"/>
@@ -1186,7 +1165,7 @@
           </w:tcPr>
           <w:p>
             <w:r>
-              <w:t>Nachfolgender Text</w:t>
+              <w:t>Vorangestellter Text</w:t>
             </w:r>
           </w:p>
         </w:tc>
@@ -1204,30 +1183,38 @@
             <w:pPr>
               <w:rPr>
                 <w:rStyle w:val="QuelltextZeichen"/>
-              </w:rPr>
-            </w:pPr>
-            <w:r>
-              <w:rPr>
-                <w:rStyle w:val="QuelltextZeichen"/>
-              </w:rPr>
-              <w:t>i</w:t>
-            </w:r>
-            <w:r>
-              <w:rPr>
-                <w:rStyle w:val="QuelltextZeichen"/>
-              </w:rPr>
-              <w:t>mmediate</w:t>
+                <w:lang w:val="en-US"/>
+              </w:rPr>
+            </w:pPr>
+            <w:r>
+              <w:rPr>
+                <w:rStyle w:val="QuelltextZeichen"/>
+              </w:rPr>
+              <w:t>suf</w:t>
+            </w:r>
+            <w:r>
+              <w:rPr>
+                <w:rStyle w:val="QuelltextZeichen"/>
+              </w:rPr>
+              <w:t>f</w:t>
+            </w:r>
+            <w:r>
+              <w:rPr>
+                <w:rStyle w:val="QuelltextZeichen"/>
+              </w:rPr>
+              <w:t>ix</w:t>
             </w:r>
           </w:p>
         </w:tc>
         <w:tc>
           <w:tcPr>
             <w:tcW w:w="1856" w:type="dxa"/>
+            <w:gridSpan w:val="2"/>
           </w:tcPr>
           <w:p>
             <w:proofErr w:type="spellStart"/>
             <w:r>
-              <w:t>boolean</w:t>
+              <w:t>string</w:t>
             </w:r>
             <w:proofErr w:type="spellEnd"/>
           </w:p>
@@ -1238,11 +1225,9 @@
             <w:gridSpan w:val="2"/>
           </w:tcPr>
           <w:p>
-            <w:proofErr w:type="spellStart"/>
-            <w:r>
-              <w:t>False</w:t>
-            </w:r>
-            <w:proofErr w:type="spellEnd"/>
+            <w:r>
+              <w:t>&lt;leer&gt;</w:t>
+            </w:r>
           </w:p>
         </w:tc>
         <w:tc>
@@ -1252,7 +1237,7 @@
           </w:tcPr>
           <w:p>
             <w:r>
-              <w:t>Löscht die aktuelle Queue und spricht den Text sofort.</w:t>
+              <w:t>Nachfolgender Text</w:t>
             </w:r>
           </w:p>
         </w:tc>
@@ -1273,21 +1258,19 @@
               <w:rPr>
                 <w:rStyle w:val="QuelltextZeichen"/>
               </w:rPr>
-              <w:t>readHidden</w:t>
+              <w:t>immediate</w:t>
             </w:r>
           </w:p>
         </w:tc>
         <w:tc>
           <w:tcPr>
             <w:tcW w:w="1856" w:type="dxa"/>
+            <w:gridSpan w:val="2"/>
           </w:tcPr>
           <w:p>
             <w:proofErr w:type="spellStart"/>
             <w:r>
-              <w:t>b</w:t>
-            </w:r>
-            <w:r>
-              <w:t>oolean</w:t>
+              <w:t>boolean</w:t>
             </w:r>
             <w:proofErr w:type="spellEnd"/>
           </w:p>
@@ -1300,10 +1283,7 @@
           <w:p>
             <w:proofErr w:type="spellStart"/>
             <w:r>
-              <w:t>f</w:t>
-            </w:r>
-            <w:r>
-              <w:t>alse</w:t>
+              <w:t>False</w:t>
             </w:r>
             <w:proofErr w:type="spellEnd"/>
           </w:p>
@@ -1315,7 +1295,7 @@
           </w:tcPr>
           <w:p>
             <w:r>
-              <w:t>Versteckte oder unsichtbare Elemente vorlesen</w:t>
+              <w:t>Löscht die aktuelle Queue und spricht den Text sofort.</w:t>
             </w:r>
           </w:p>
         </w:tc>
@@ -1339,29 +1319,21 @@
               <w:rPr>
                 <w:rStyle w:val="QuelltextZeichen"/>
               </w:rPr>
-              <w:t>e</w:t>
-            </w:r>
-            <w:r>
-              <w:rPr>
-                <w:rStyle w:val="QuelltextZeichen"/>
-              </w:rPr>
-              <w:t>xclude</w:t>
+              <w:t>readHidden</w:t>
             </w:r>
           </w:p>
         </w:tc>
         <w:tc>
           <w:tcPr>
             <w:tcW w:w="1856" w:type="dxa"/>
+            <w:gridSpan w:val="2"/>
           </w:tcPr>
           <w:p>
             <w:proofErr w:type="spellStart"/>
             <w:r>
-              <w:t>string</w:t>
+              <w:t>boolean</w:t>
             </w:r>
             <w:proofErr w:type="spellEnd"/>
-            <w:r>
-              <w:t xml:space="preserve"> | Array</w:t>
-            </w:r>
           </w:p>
         </w:tc>
         <w:tc>
@@ -1370,9 +1342,11 @@
             <w:gridSpan w:val="2"/>
           </w:tcPr>
           <w:p>
-            <w:r>
-              <w:t>""</w:t>
-            </w:r>
+            <w:proofErr w:type="spellStart"/>
+            <w:r>
+              <w:t>false</w:t>
+            </w:r>
+            <w:proofErr w:type="spellEnd"/>
           </w:p>
         </w:tc>
         <w:tc>
@@ -1381,13 +1355,8 @@
             <w:gridSpan w:val="2"/>
           </w:tcPr>
           <w:p>
-            <w:proofErr w:type="spellStart"/>
-            <w:r>
-              <w:t>Selector</w:t>
-            </w:r>
-            <w:proofErr w:type="spellEnd"/>
-            <w:r>
-              <w:t>(en) für zu ignorierende Unterelemente</w:t>
+            <w:r>
+              <w:t>Versteckte oder unsichtbare Elemente vorlesen</w:t>
             </w:r>
           </w:p>
         </w:tc>
@@ -1408,6 +1377,73 @@
               <w:rPr>
                 <w:rStyle w:val="QuelltextZeichen"/>
               </w:rPr>
+              <w:t>exclude</w:t>
+            </w:r>
+          </w:p>
+        </w:tc>
+        <w:tc>
+          <w:tcPr>
+            <w:tcW w:w="1856" w:type="dxa"/>
+            <w:gridSpan w:val="2"/>
+          </w:tcPr>
+          <w:p>
+            <w:proofErr w:type="spellStart"/>
+            <w:r>
+              <w:t>string</w:t>
+            </w:r>
+            <w:proofErr w:type="spellEnd"/>
+            <w:r>
+              <w:t xml:space="preserve"> | Array</w:t>
+            </w:r>
+          </w:p>
+        </w:tc>
+        <w:tc>
+          <w:tcPr>
+            <w:tcW w:w="1322" w:type="dxa"/>
+            <w:gridSpan w:val="2"/>
+          </w:tcPr>
+          <w:p>
+            <w:r>
+              <w:t>""</w:t>
+            </w:r>
+          </w:p>
+        </w:tc>
+        <w:tc>
+          <w:tcPr>
+            <w:tcW w:w="3895" w:type="dxa"/>
+            <w:gridSpan w:val="2"/>
+          </w:tcPr>
+          <w:p>
+            <w:proofErr w:type="spellStart"/>
+            <w:r>
+              <w:t>Selector</w:t>
+            </w:r>
+            <w:proofErr w:type="spellEnd"/>
+            <w:r>
+              <w:t>(en) für zu ignorierende Unterelemente</w:t>
+            </w:r>
+          </w:p>
+        </w:tc>
+      </w:tr>
+      <w:tr>
+        <w:trPr>
+          <w:cnfStyle w:val="000000100000" w:firstRow="0" w:lastRow="0" w:firstColumn="0" w:lastColumn="0" w:oddVBand="0" w:evenVBand="0" w:oddHBand="1" w:evenHBand="0" w:firstRowFirstColumn="0" w:firstRowLastColumn="0" w:lastRowFirstColumn="0" w:lastRowLastColumn="0"/>
+        </w:trPr>
+        <w:tc>
+          <w:tcPr>
+            <w:tcW w:w="1989" w:type="dxa"/>
+            <w:gridSpan w:val="3"/>
+          </w:tcPr>
+          <w:p>
+            <w:pPr>
+              <w:rPr>
+                <w:rStyle w:val="QuelltextZeichen"/>
+              </w:rPr>
+            </w:pPr>
+            <w:r>
+              <w:rPr>
+                <w:rStyle w:val="QuelltextZeichen"/>
+              </w:rPr>
               <w:t>extract</w:t>
             </w:r>
           </w:p>
@@ -1415,6 +1451,7 @@
         <w:tc>
           <w:tcPr>
             <w:tcW w:w="1856" w:type="dxa"/>
+            <w:gridSpan w:val="2"/>
           </w:tcPr>
           <w:p>
             <w:proofErr w:type="spellStart"/>
@@ -1506,13 +1543,8 @@
               <w:t>{</w:t>
             </w:r>
             <w:proofErr w:type="spellStart"/>
-            <w:proofErr w:type="gramStart"/>
-            <w:r>
-              <w:t>text,pitch</w:t>
-            </w:r>
-            <w:proofErr w:type="gramEnd"/>
-            <w:r>
-              <w:t>,rate,volume</w:t>
+            <w:r>
+              <w:t>text,pitch,rate,volume</w:t>
             </w:r>
             <w:proofErr w:type="spellEnd"/>
             <w:r>
@@ -1531,13 +1563,8 @@
               <w:t>[{</w:t>
             </w:r>
             <w:proofErr w:type="spellStart"/>
-            <w:proofErr w:type="gramStart"/>
-            <w:r>
-              <w:t>text,pitch</w:t>
-            </w:r>
-            <w:proofErr w:type="gramEnd"/>
-            <w:r>
-              <w:t>,rate,volume</w:t>
+            <w:r>
+              <w:t>text,pitch,rate,volume</w:t>
             </w:r>
             <w:proofErr w:type="spellEnd"/>
             <w:r>
@@ -1605,26 +1632,13 @@
               <w:t>node</w:t>
             </w:r>
             <w:proofErr w:type="spellEnd"/>
-            <w:proofErr w:type="gramStart"/>
-            <w:r>
-              <w:t>){</w:t>
-            </w:r>
-            <w:proofErr w:type="gramEnd"/>
-            <w:r>
-              <w:t>…}</w:t>
-            </w:r>
-          </w:p>
-          <w:p>
-            <w:r>
-              <w:t xml:space="preserve">Definiert wird, </w:t>
-            </w:r>
-            <w:proofErr w:type="gramStart"/>
-            <w:r>
-              <w:t>stehen  innerhalb</w:t>
-            </w:r>
-            <w:proofErr w:type="gramEnd"/>
-            <w:r>
-              <w:t xml:space="preserve"> der Funktion die Methoden</w:t>
+            <w:r>
+              <w:t>){…}</w:t>
+            </w:r>
+          </w:p>
+          <w:p>
+            <w:r>
+              <w:t>Definiert wird, stehen  innerhalb der Funktion die Methoden</w:t>
             </w:r>
           </w:p>
           <w:p>
@@ -1658,16 +1672,111 @@
               <w:tab/>
             </w:r>
             <w:proofErr w:type="spellStart"/>
-            <w:proofErr w:type="gramStart"/>
             <w:r>
               <w:t>this.format</w:t>
             </w:r>
             <w:proofErr w:type="spellEnd"/>
-            <w:proofErr w:type="gramEnd"/>
           </w:p>
           <w:p>
             <w:r>
               <w:t>zur Verfügung.</w:t>
+            </w:r>
+          </w:p>
+        </w:tc>
+      </w:tr>
+      <w:tr>
+        <w:tc>
+          <w:tcPr>
+            <w:tcW w:w="1989" w:type="dxa"/>
+            <w:gridSpan w:val="3"/>
+          </w:tcPr>
+          <w:p>
+            <w:pPr>
+              <w:rPr>
+                <w:rStyle w:val="QuelltextZeichen"/>
+              </w:rPr>
+            </w:pPr>
+            <w:r>
+              <w:rPr>
+                <w:rStyle w:val="QuelltextZeichen"/>
+              </w:rPr>
+              <w:t>replace</w:t>
+            </w:r>
+          </w:p>
+        </w:tc>
+        <w:tc>
+          <w:tcPr>
+            <w:tcW w:w="1856" w:type="dxa"/>
+            <w:gridSpan w:val="2"/>
+          </w:tcPr>
+          <w:p>
+            <w:proofErr w:type="spellStart"/>
+            <w:r>
+              <w:t>object</w:t>
+            </w:r>
+            <w:proofErr w:type="spellEnd"/>
+            <w:r>
+              <w:t xml:space="preserve"> | Array</w:t>
+            </w:r>
+          </w:p>
+        </w:tc>
+        <w:tc>
+          <w:tcPr>
+            <w:tcW w:w="1322" w:type="dxa"/>
+            <w:gridSpan w:val="2"/>
+          </w:tcPr>
+          <w:p>
+            <w:r>
+              <w:t>null</w:t>
+            </w:r>
+          </w:p>
+        </w:tc>
+        <w:tc>
+          <w:tcPr>
+            <w:tcW w:w="3895" w:type="dxa"/>
+            <w:gridSpan w:val="2"/>
+            <w:vMerge w:val="restart"/>
+          </w:tcPr>
+          <w:p>
+            <w:pPr>
+              <w:rPr>
+                <w:rStyle w:val="QuelltextZeichen"/>
+              </w:rPr>
+            </w:pPr>
+            <w:r>
+              <w:t xml:space="preserve">Textersetzungen. Der Parameter enthält entweder ein </w:t>
+            </w:r>
+            <w:proofErr w:type="spellStart"/>
+            <w:r>
+              <w:t>Object</w:t>
+            </w:r>
+            <w:proofErr w:type="spellEnd"/>
+            <w:r>
+              <w:t xml:space="preserve"> mit den Attributen </w:t>
+            </w:r>
+            <w:r>
+              <w:rPr>
+                <w:rStyle w:val="QuelltextZeichen"/>
+              </w:rPr>
+              <w:t xml:space="preserve">pattern </w:t>
+            </w:r>
+            <w:r>
+              <w:t xml:space="preserve">und </w:t>
+            </w:r>
+            <w:r>
+              <w:rPr>
+                <w:rStyle w:val="QuelltextZeichen"/>
+              </w:rPr>
+              <w:t>replacement</w:t>
+            </w:r>
+            <w:r>
+              <w:t xml:space="preserve">, oder ein Array mit entsprechenden Objekten. Siehe </w:t>
+            </w:r>
+            <w:r>
+              <w:rPr>
+                <w:rStyle w:val="QuelltextZeichen"/>
+              </w:rPr>
+              <w:t>String.replace()</w:t>
             </w:r>
           </w:p>
         </w:tc>
@@ -1678,36 +1787,54 @@
         </w:trPr>
         <w:tc>
           <w:tcPr>
-            <w:tcW w:w="1989" w:type="dxa"/>
-            <w:gridSpan w:val="3"/>
-          </w:tcPr>
-          <w:p>
-            <w:pPr>
-              <w:rPr>
-                <w:rStyle w:val="QuelltextZeichen"/>
-              </w:rPr>
-            </w:pPr>
-            <w:r>
-              <w:rPr>
-                <w:rStyle w:val="QuelltextZeichen"/>
-              </w:rPr>
-              <w:t>replace</w:t>
+            <w:tcW w:w="399" w:type="dxa"/>
+          </w:tcPr>
+          <w:p>
+            <w:pPr>
+              <w:rPr>
+                <w:rStyle w:val="QuelltextZeichen"/>
+              </w:rPr>
+            </w:pPr>
+          </w:p>
+        </w:tc>
+        <w:tc>
+          <w:tcPr>
+            <w:tcW w:w="1590" w:type="dxa"/>
+            <w:gridSpan w:val="2"/>
+          </w:tcPr>
+          <w:p>
+            <w:pPr>
+              <w:rPr>
+                <w:rStyle w:val="QuelltextZeichen"/>
+              </w:rPr>
+            </w:pPr>
+            <w:r>
+              <w:rPr>
+                <w:rStyle w:val="QuelltextZeichen"/>
+              </w:rPr>
+              <w:t>pattern</w:t>
             </w:r>
           </w:p>
         </w:tc>
         <w:tc>
           <w:tcPr>
             <w:tcW w:w="1856" w:type="dxa"/>
+            <w:gridSpan w:val="2"/>
           </w:tcPr>
           <w:p>
             <w:proofErr w:type="spellStart"/>
             <w:r>
-              <w:t>object</w:t>
+              <w:t>string</w:t>
             </w:r>
             <w:proofErr w:type="spellEnd"/>
             <w:r>
-              <w:t xml:space="preserve"> | Array</w:t>
-            </w:r>
+              <w:t xml:space="preserve"> | </w:t>
+            </w:r>
+            <w:proofErr w:type="spellStart"/>
+            <w:r>
+              <w:t>RegularExpression</w:t>
+            </w:r>
+            <w:proofErr w:type="spellEnd"/>
           </w:p>
         </w:tc>
         <w:tc>
@@ -1715,65 +1842,15 @@
             <w:tcW w:w="1322" w:type="dxa"/>
             <w:gridSpan w:val="2"/>
           </w:tcPr>
-          <w:p>
-            <w:r>
-              <w:t>null</w:t>
-            </w:r>
-          </w:p>
+          <w:p/>
         </w:tc>
         <w:tc>
           <w:tcPr>
             <w:tcW w:w="3895" w:type="dxa"/>
             <w:gridSpan w:val="2"/>
-            <w:vMerge w:val="restart"/>
-          </w:tcPr>
-          <w:p>
-            <w:pPr>
-              <w:rPr>
-                <w:rStyle w:val="QuelltextZeichen"/>
-              </w:rPr>
-            </w:pPr>
-            <w:r>
-              <w:t xml:space="preserve">Textersetzungen. Der Parameter enthält entweder ein </w:t>
-            </w:r>
-            <w:proofErr w:type="spellStart"/>
-            <w:r>
-              <w:t>Object</w:t>
-            </w:r>
-            <w:proofErr w:type="spellEnd"/>
-            <w:r>
-              <w:t xml:space="preserve"> mit den Attributen </w:t>
-            </w:r>
-            <w:r>
-              <w:rPr>
-                <w:rStyle w:val="QuelltextZeichen"/>
-              </w:rPr>
-              <w:t xml:space="preserve">pattern </w:t>
-            </w:r>
-            <w:r>
-              <w:t xml:space="preserve">und </w:t>
-            </w:r>
-            <w:proofErr w:type="gramStart"/>
-            <w:r>
-              <w:rPr>
-                <w:rStyle w:val="QuelltextZeichen"/>
-              </w:rPr>
-              <w:t>replacement</w:t>
-            </w:r>
-            <w:r>
-              <w:t>,</w:t>
-            </w:r>
-            <w:proofErr w:type="gramEnd"/>
-            <w:r>
-              <w:t xml:space="preserve"> oder ein Array mit entsprechenden Objekten. Siehe </w:t>
-            </w:r>
-            <w:r>
-              <w:rPr>
-                <w:rStyle w:val="QuelltextZeichen"/>
-              </w:rPr>
-              <w:t>String.replace()</w:t>
-            </w:r>
-          </w:p>
+            <w:vMerge/>
+          </w:tcPr>
+          <w:p/>
         </w:tc>
       </w:tr>
       <w:tr>
@@ -1804,13 +1881,14 @@
               <w:rPr>
                 <w:rStyle w:val="QuelltextZeichen"/>
               </w:rPr>
-              <w:t>pattern</w:t>
+              <w:t>replacement</w:t>
             </w:r>
           </w:p>
         </w:tc>
         <w:tc>
           <w:tcPr>
             <w:tcW w:w="1856" w:type="dxa"/>
+            <w:gridSpan w:val="2"/>
           </w:tcPr>
           <w:p>
             <w:proofErr w:type="spellStart"/>
@@ -1823,7 +1901,7 @@
             </w:r>
             <w:proofErr w:type="spellStart"/>
             <w:r>
-              <w:t>RegularExpression</w:t>
+              <w:t>function</w:t>
             </w:r>
             <w:proofErr w:type="spellEnd"/>
           </w:p>
@@ -1850,54 +1928,23 @@
         </w:trPr>
         <w:tc>
           <w:tcPr>
-            <w:tcW w:w="399" w:type="dxa"/>
-          </w:tcPr>
-          <w:p>
-            <w:pPr>
-              <w:rPr>
-                <w:rStyle w:val="QuelltextZeichen"/>
-              </w:rPr>
-            </w:pPr>
-          </w:p>
-        </w:tc>
-        <w:tc>
-          <w:tcPr>
-            <w:tcW w:w="1590" w:type="dxa"/>
-            <w:gridSpan w:val="2"/>
-          </w:tcPr>
-          <w:p>
-            <w:pPr>
-              <w:rPr>
-                <w:rStyle w:val="QuelltextZeichen"/>
-              </w:rPr>
-            </w:pPr>
-            <w:r>
-              <w:rPr>
-                <w:rStyle w:val="QuelltextZeichen"/>
-              </w:rPr>
-              <w:t>replacement</w:t>
-            </w:r>
+            <w:tcW w:w="1989" w:type="dxa"/>
+            <w:gridSpan w:val="3"/>
+          </w:tcPr>
+          <w:p>
+            <w:pPr>
+              <w:rPr>
+                <w:rStyle w:val="QuelltextZeichen"/>
+              </w:rPr>
+            </w:pPr>
           </w:p>
         </w:tc>
         <w:tc>
           <w:tcPr>
             <w:tcW w:w="1856" w:type="dxa"/>
-          </w:tcPr>
-          <w:p>
-            <w:proofErr w:type="spellStart"/>
-            <w:r>
-              <w:t>string</w:t>
-            </w:r>
-            <w:proofErr w:type="spellEnd"/>
-            <w:r>
-              <w:t xml:space="preserve"> | </w:t>
-            </w:r>
-            <w:proofErr w:type="spellStart"/>
-            <w:r>
-              <w:t>function</w:t>
-            </w:r>
-            <w:proofErr w:type="spellEnd"/>
-          </w:p>
+            <w:gridSpan w:val="2"/>
+          </w:tcPr>
+          <w:p/>
         </w:tc>
         <w:tc>
           <w:tcPr>
@@ -1910,7 +1957,6 @@
           <w:tcPr>
             <w:tcW w:w="3895" w:type="dxa"/>
             <w:gridSpan w:val="2"/>
-            <w:vMerge/>
           </w:tcPr>
           <w:p/>
         </w:tc>
@@ -1927,27 +1973,56 @@
                 <w:rStyle w:val="QuelltextZeichen"/>
               </w:rPr>
             </w:pPr>
+            <w:r>
+              <w:rPr>
+                <w:rStyle w:val="QuelltextZeichen"/>
+              </w:rPr>
+              <w:t>childElements</w:t>
+            </w:r>
           </w:p>
         </w:tc>
         <w:tc>
           <w:tcPr>
             <w:tcW w:w="1856" w:type="dxa"/>
-          </w:tcPr>
-          <w:p/>
+            <w:gridSpan w:val="2"/>
+          </w:tcPr>
+          <w:p>
+            <w:proofErr w:type="spellStart"/>
+            <w:r>
+              <w:t>object</w:t>
+            </w:r>
+            <w:proofErr w:type="spellEnd"/>
+          </w:p>
         </w:tc>
         <w:tc>
           <w:tcPr>
             <w:tcW w:w="1322" w:type="dxa"/>
             <w:gridSpan w:val="2"/>
           </w:tcPr>
-          <w:p/>
+          <w:p>
+            <w:r>
+              <w:t>null</w:t>
+            </w:r>
+          </w:p>
         </w:tc>
         <w:tc>
           <w:tcPr>
             <w:tcW w:w="3895" w:type="dxa"/>
             <w:gridSpan w:val="2"/>
           </w:tcPr>
-          <w:p/>
+          <w:p>
+            <w:r>
+              <w:t>Optionen für bestimmte Unterelemente. Die Optionen für ein Unterelement werden mit dem CSS-</w:t>
+            </w:r>
+            <w:proofErr w:type="spellStart"/>
+            <w:r>
+              <w:t>Selector</w:t>
+            </w:r>
+            <w:proofErr w:type="spellEnd"/>
+            <w:r>
+              <w:t xml:space="preserve"> als Key angegeben.</w:t>
+            </w:r>
+          </w:p>
         </w:tc>
       </w:tr>
       <w:tr>
@@ -1956,75 +2031,6 @@
         </w:trPr>
         <w:tc>
           <w:tcPr>
-            <w:tcW w:w="1989" w:type="dxa"/>
-            <w:gridSpan w:val="3"/>
-          </w:tcPr>
-          <w:p>
-            <w:pPr>
-              <w:rPr>
-                <w:rStyle w:val="QuelltextZeichen"/>
-              </w:rPr>
-            </w:pPr>
-            <w:r>
-              <w:rPr>
-                <w:rStyle w:val="QuelltextZeichen"/>
-              </w:rPr>
-              <w:t>childElements</w:t>
-            </w:r>
-          </w:p>
-        </w:tc>
-        <w:tc>
-          <w:tcPr>
-            <w:tcW w:w="1856" w:type="dxa"/>
-          </w:tcPr>
-          <w:p>
-            <w:proofErr w:type="spellStart"/>
-            <w:r>
-              <w:t>obje</w:t>
-            </w:r>
-            <w:r>
-              <w:t>ct</w:t>
-            </w:r>
-            <w:proofErr w:type="spellEnd"/>
-          </w:p>
-        </w:tc>
-        <w:tc>
-          <w:tcPr>
-            <w:tcW w:w="1322" w:type="dxa"/>
-            <w:gridSpan w:val="2"/>
-          </w:tcPr>
-          <w:p>
-            <w:r>
-              <w:t>null</w:t>
-            </w:r>
-          </w:p>
-        </w:tc>
-        <w:tc>
-          <w:tcPr>
-            <w:tcW w:w="3895" w:type="dxa"/>
-            <w:gridSpan w:val="2"/>
-          </w:tcPr>
-          <w:p>
-            <w:r>
-              <w:t>Optionen für bestimmte Unterelemente</w:t>
-            </w:r>
-            <w:r>
-              <w:t>. Die Optionen für ein Unterelement werden mit dem CSS-</w:t>
-            </w:r>
-            <w:proofErr w:type="spellStart"/>
-            <w:r>
-              <w:t>Selector</w:t>
-            </w:r>
-            <w:proofErr w:type="spellEnd"/>
-            <w:r>
-              <w:t xml:space="preserve"> als Key angegeben.</w:t>
-            </w:r>
-          </w:p>
-        </w:tc>
-      </w:tr>
-      <w:tr>
-        <w:tc>
-          <w:tcPr>
             <w:tcW w:w="399" w:type="dxa"/>
             <w:tcBorders>
               <w:right w:val="single" w:sz="24" w:space="0" w:color="548DD4" w:themeColor="text2" w:themeTint="99"/>
@@ -2063,6 +2069,73 @@
         <w:tc>
           <w:tcPr>
             <w:tcW w:w="1856" w:type="dxa"/>
+            <w:gridSpan w:val="2"/>
+          </w:tcPr>
+          <w:p>
+            <w:proofErr w:type="spellStart"/>
+            <w:r>
+              <w:t>float</w:t>
+            </w:r>
+            <w:proofErr w:type="spellEnd"/>
+          </w:p>
+        </w:tc>
+        <w:tc>
+          <w:tcPr>
+            <w:tcW w:w="1322" w:type="dxa"/>
+            <w:gridSpan w:val="2"/>
+          </w:tcPr>
+          <w:p/>
+        </w:tc>
+        <w:tc>
+          <w:tcPr>
+            <w:tcW w:w="3895" w:type="dxa"/>
+            <w:gridSpan w:val="2"/>
+          </w:tcPr>
+          <w:p/>
+        </w:tc>
+      </w:tr>
+      <w:tr>
+        <w:tc>
+          <w:tcPr>
+            <w:tcW w:w="399" w:type="dxa"/>
+            <w:tcBorders>
+              <w:right w:val="single" w:sz="24" w:space="0" w:color="548DD4" w:themeColor="text2" w:themeTint="99"/>
+            </w:tcBorders>
+          </w:tcPr>
+          <w:p>
+            <w:pPr>
+              <w:rPr>
+                <w:rStyle w:val="QuelltextZeichen"/>
+              </w:rPr>
+            </w:pPr>
+          </w:p>
+        </w:tc>
+        <w:tc>
+          <w:tcPr>
+            <w:tcW w:w="1590" w:type="dxa"/>
+            <w:gridSpan w:val="2"/>
+            <w:tcBorders>
+              <w:left w:val="single" w:sz="24" w:space="0" w:color="548DD4" w:themeColor="text2" w:themeTint="99"/>
+            </w:tcBorders>
+          </w:tcPr>
+          <w:p>
+            <w:pPr>
+              <w:rPr>
+                <w:rStyle w:val="QuelltextZeichen"/>
+              </w:rPr>
+            </w:pPr>
+            <w:r>
+              <w:rPr>
+                <w:rStyle w:val="QuelltextZeichen"/>
+              </w:rPr>
+              <w:t>pitch</w:t>
+            </w:r>
+          </w:p>
+        </w:tc>
+        <w:tc>
+          <w:tcPr>
+            <w:tcW w:w="1856" w:type="dxa"/>
+            <w:gridSpan w:val="2"/>
           </w:tcPr>
           <w:p>
             <w:proofErr w:type="spellStart"/>
@@ -2124,13 +2197,14 @@
               <w:rPr>
                 <w:rStyle w:val="QuelltextZeichen"/>
               </w:rPr>
-              <w:t>pitch</w:t>
+              <w:t>volume</w:t>
             </w:r>
           </w:p>
         </w:tc>
         <w:tc>
           <w:tcPr>
             <w:tcW w:w="1856" w:type="dxa"/>
+            <w:gridSpan w:val="2"/>
           </w:tcPr>
           <w:p>
             <w:proofErr w:type="spellStart"/>
@@ -2189,20 +2263,19 @@
               <w:rPr>
                 <w:rStyle w:val="QuelltextZeichen"/>
               </w:rPr>
-              <w:t>volume</w:t>
+              <w:t>language</w:t>
             </w:r>
           </w:p>
         </w:tc>
         <w:tc>
           <w:tcPr>
             <w:tcW w:w="1856" w:type="dxa"/>
-          </w:tcPr>
-          <w:p>
-            <w:proofErr w:type="spellStart"/>
-            <w:r>
-              <w:t>float</w:t>
-            </w:r>
-            <w:proofErr w:type="spellEnd"/>
+            <w:gridSpan w:val="2"/>
+          </w:tcPr>
+          <w:p>
+            <w:r>
+              <w:t>String</w:t>
+            </w:r>
           </w:p>
         </w:tc>
         <w:tc>
@@ -2257,18 +2330,21 @@
               <w:rPr>
                 <w:rStyle w:val="QuelltextZeichen"/>
               </w:rPr>
-              <w:t>language</w:t>
+              <w:t>prefix</w:t>
             </w:r>
           </w:p>
         </w:tc>
         <w:tc>
           <w:tcPr>
             <w:tcW w:w="1856" w:type="dxa"/>
-          </w:tcPr>
-          <w:p>
-            <w:r>
-              <w:t>String</w:t>
-            </w:r>
+            <w:gridSpan w:val="2"/>
+          </w:tcPr>
+          <w:p>
+            <w:proofErr w:type="spellStart"/>
+            <w:r>
+              <w:t>string</w:t>
+            </w:r>
+            <w:proofErr w:type="spellEnd"/>
           </w:p>
         </w:tc>
         <w:tc>
@@ -2320,13 +2396,14 @@
               <w:rPr>
                 <w:rStyle w:val="QuelltextZeichen"/>
               </w:rPr>
-              <w:t>prefix</w:t>
+              <w:t>suffix</w:t>
             </w:r>
           </w:p>
         </w:tc>
         <w:tc>
           <w:tcPr>
             <w:tcW w:w="1856" w:type="dxa"/>
+            <w:gridSpan w:val="2"/>
           </w:tcPr>
           <w:p>
             <w:proofErr w:type="spellStart"/>
@@ -2388,25 +2465,14 @@
               <w:rPr>
                 <w:rStyle w:val="QuelltextZeichen"/>
               </w:rPr>
-              <w:t>su</w:t>
-            </w:r>
-            <w:r>
-              <w:rPr>
-                <w:rStyle w:val="QuelltextZeichen"/>
-              </w:rPr>
-              <w:t>f</w:t>
-            </w:r>
-            <w:r>
-              <w:rPr>
-                <w:rStyle w:val="QuelltextZeichen"/>
-              </w:rPr>
-              <w:t>fix</w:t>
+              <w:t>text</w:t>
             </w:r>
           </w:p>
         </w:tc>
         <w:tc>
           <w:tcPr>
             <w:tcW w:w="1856" w:type="dxa"/>
+            <w:gridSpan w:val="2"/>
           </w:tcPr>
           <w:p>
             <w:proofErr w:type="spellStart"/>
@@ -2465,18 +2531,19 @@
               <w:rPr>
                 <w:rStyle w:val="QuelltextZeichen"/>
               </w:rPr>
-              <w:t>text</w:t>
+              <w:t>extract</w:t>
             </w:r>
           </w:p>
         </w:tc>
         <w:tc>
           <w:tcPr>
             <w:tcW w:w="1856" w:type="dxa"/>
+            <w:gridSpan w:val="2"/>
           </w:tcPr>
           <w:p>
             <w:proofErr w:type="spellStart"/>
             <w:r>
-              <w:t>string</w:t>
+              <w:t>function</w:t>
             </w:r>
             <w:proofErr w:type="spellEnd"/>
           </w:p>
@@ -2493,7 +2560,11 @@
             <w:tcW w:w="3895" w:type="dxa"/>
             <w:gridSpan w:val="2"/>
           </w:tcPr>
-          <w:p/>
+          <w:p>
+            <w:r>
+              <w:t>s. oben</w:t>
+            </w:r>
+          </w:p>
         </w:tc>
       </w:tr>
       <w:tr>
@@ -2533,20 +2604,24 @@
               <w:rPr>
                 <w:rStyle w:val="QuelltextZeichen"/>
               </w:rPr>
-              <w:t>extract</w:t>
+              <w:t>replace</w:t>
             </w:r>
           </w:p>
         </w:tc>
         <w:tc>
           <w:tcPr>
             <w:tcW w:w="1856" w:type="dxa"/>
+            <w:gridSpan w:val="2"/>
           </w:tcPr>
           <w:p>
             <w:proofErr w:type="spellStart"/>
             <w:r>
-              <w:t>function</w:t>
+              <w:t>object</w:t>
             </w:r>
             <w:proofErr w:type="spellEnd"/>
+            <w:r>
+              <w:t xml:space="preserve"> | Array</w:t>
+            </w:r>
           </w:p>
         </w:tc>
         <w:tc>
@@ -2560,10 +2635,48 @@
           <w:tcPr>
             <w:tcW w:w="3895" w:type="dxa"/>
             <w:gridSpan w:val="2"/>
-          </w:tcPr>
-          <w:p>
-            <w:r>
-              <w:t>s. oben</w:t>
+            <w:vMerge w:val="restart"/>
+          </w:tcPr>
+          <w:p>
+            <w:pPr>
+              <w:rPr>
+                <w:rStyle w:val="QuelltextZeichen"/>
+              </w:rPr>
+            </w:pPr>
+            <w:r>
+              <w:t xml:space="preserve">Textersetzungen. Der Parameter enthält entweder ein </w:t>
+            </w:r>
+            <w:proofErr w:type="spellStart"/>
+            <w:r>
+              <w:t>Object</w:t>
+            </w:r>
+            <w:proofErr w:type="spellEnd"/>
+            <w:r>
+              <w:t xml:space="preserve"> mit den Attributen </w:t>
+            </w:r>
+            <w:r>
+              <w:rPr>
+                <w:rStyle w:val="QuelltextZeichen"/>
+              </w:rPr>
+              <w:t xml:space="preserve">pattern </w:t>
+            </w:r>
+            <w:r>
+              <w:t xml:space="preserve">und </w:t>
+            </w:r>
+            <w:r>
+              <w:rPr>
+                <w:rStyle w:val="QuelltextZeichen"/>
+              </w:rPr>
+              <w:t>replacement</w:t>
+            </w:r>
+            <w:r>
+              <w:t xml:space="preserve">, oder ein Array mit ebensolchen Objekten. Siehe </w:t>
+            </w:r>
+            <w:r>
+              <w:rPr>
+                <w:rStyle w:val="QuelltextZeichen"/>
+              </w:rPr>
+              <w:t>String.replace()</w:t>
             </w:r>
           </w:p>
         </w:tc>
@@ -2571,54 +2684,54 @@
       <w:tr>
         <w:tc>
           <w:tcPr>
-            <w:tcW w:w="399" w:type="dxa"/>
-            <w:tcBorders>
-              <w:right w:val="single" w:sz="24" w:space="0" w:color="548DD4" w:themeColor="text2" w:themeTint="99"/>
-            </w:tcBorders>
-          </w:tcPr>
-          <w:p>
-            <w:pPr>
-              <w:rPr>
-                <w:rStyle w:val="QuelltextZeichen"/>
-              </w:rPr>
-            </w:pPr>
-          </w:p>
-        </w:tc>
-        <w:tc>
-          <w:tcPr>
-            <w:tcW w:w="1590" w:type="dxa"/>
-            <w:gridSpan w:val="2"/>
-            <w:tcBorders>
-              <w:left w:val="single" w:sz="24" w:space="0" w:color="548DD4" w:themeColor="text2" w:themeTint="99"/>
-            </w:tcBorders>
-          </w:tcPr>
-          <w:p>
-            <w:pPr>
-              <w:rPr>
-                <w:rStyle w:val="QuelltextZeichen"/>
-              </w:rPr>
-            </w:pPr>
-            <w:r>
-              <w:rPr>
-                <w:rStyle w:val="QuelltextZeichen"/>
-              </w:rPr>
-              <w:t>replace</w:t>
+            <w:tcW w:w="650" w:type="dxa"/>
+            <w:gridSpan w:val="2"/>
+          </w:tcPr>
+          <w:p>
+            <w:pPr>
+              <w:rPr>
+                <w:rStyle w:val="QuelltextZeichen"/>
+              </w:rPr>
+            </w:pPr>
+          </w:p>
+        </w:tc>
+        <w:tc>
+          <w:tcPr>
+            <w:tcW w:w="1339" w:type="dxa"/>
+          </w:tcPr>
+          <w:p>
+            <w:pPr>
+              <w:rPr>
+                <w:rStyle w:val="QuelltextZeichen"/>
+              </w:rPr>
+            </w:pPr>
+            <w:r>
+              <w:rPr>
+                <w:rStyle w:val="QuelltextZeichen"/>
+              </w:rPr>
+              <w:t>pattern</w:t>
             </w:r>
           </w:p>
         </w:tc>
         <w:tc>
           <w:tcPr>
             <w:tcW w:w="1856" w:type="dxa"/>
+            <w:gridSpan w:val="2"/>
           </w:tcPr>
           <w:p>
             <w:proofErr w:type="spellStart"/>
             <w:r>
-              <w:t>object</w:t>
+              <w:t>string</w:t>
             </w:r>
             <w:proofErr w:type="spellEnd"/>
             <w:r>
-              <w:t xml:space="preserve"> | Array</w:t>
-            </w:r>
+              <w:t xml:space="preserve"> | </w:t>
+            </w:r>
+            <w:proofErr w:type="spellStart"/>
+            <w:r>
+              <w:t>RegularExpression</w:t>
+            </w:r>
+            <w:proofErr w:type="spellEnd"/>
           </w:p>
         </w:tc>
         <w:tc>
@@ -2632,61 +2745,9 @@
           <w:tcPr>
             <w:tcW w:w="3895" w:type="dxa"/>
             <w:gridSpan w:val="2"/>
-            <w:vMerge w:val="restart"/>
-          </w:tcPr>
-          <w:p>
-            <w:pPr>
-              <w:rPr>
-                <w:rStyle w:val="QuelltextZeichen"/>
-              </w:rPr>
-            </w:pPr>
-            <w:r>
-              <w:t xml:space="preserve">Textersetzungen. Der Parameter enthält entweder ein </w:t>
-            </w:r>
-            <w:proofErr w:type="spellStart"/>
-            <w:r>
-              <w:t>Object</w:t>
-            </w:r>
-            <w:proofErr w:type="spellEnd"/>
-            <w:r>
-              <w:t xml:space="preserve"> mit den Attributen </w:t>
-            </w:r>
-            <w:r>
-              <w:rPr>
-                <w:rStyle w:val="QuelltextZeichen"/>
-              </w:rPr>
-              <w:t xml:space="preserve">pattern </w:t>
-            </w:r>
-            <w:r>
-              <w:t xml:space="preserve">und </w:t>
-            </w:r>
-            <w:proofErr w:type="gramStart"/>
-            <w:r>
-              <w:rPr>
-                <w:rStyle w:val="QuelltextZeichen"/>
-              </w:rPr>
-              <w:t>replacement</w:t>
-            </w:r>
-            <w:r>
-              <w:t>,</w:t>
-            </w:r>
-            <w:proofErr w:type="gramEnd"/>
-            <w:r>
-              <w:t xml:space="preserve"> oder ein Array mit </w:t>
-            </w:r>
-            <w:r>
-              <w:t>ebensolchen</w:t>
-            </w:r>
-            <w:r>
-              <w:t xml:space="preserve"> Objekten. Siehe </w:t>
-            </w:r>
-            <w:r>
-              <w:rPr>
-                <w:rStyle w:val="QuelltextZeichen"/>
-              </w:rPr>
-              <w:t>String.replace()</w:t>
-            </w:r>
-          </w:p>
+            <w:vMerge/>
+          </w:tcPr>
+          <w:p/>
         </w:tc>
       </w:tr>
       <w:tr>
@@ -2720,13 +2781,14 @@
               <w:rPr>
                 <w:rStyle w:val="QuelltextZeichen"/>
               </w:rPr>
-              <w:t>pattern</w:t>
+              <w:t>replacement</w:t>
             </w:r>
           </w:p>
         </w:tc>
         <w:tc>
           <w:tcPr>
             <w:tcW w:w="1856" w:type="dxa"/>
+            <w:gridSpan w:val="2"/>
           </w:tcPr>
           <w:p>
             <w:proofErr w:type="spellStart"/>
@@ -2739,7 +2801,7 @@
             </w:r>
             <w:proofErr w:type="spellStart"/>
             <w:r>
-              <w:t>RegularExpression</w:t>
+              <w:t>function</w:t>
             </w:r>
             <w:proofErr w:type="spellEnd"/>
           </w:p>
@@ -2763,103 +2825,33 @@
       <w:tr>
         <w:tc>
           <w:tcPr>
-            <w:tcW w:w="650" w:type="dxa"/>
-            <w:gridSpan w:val="2"/>
-          </w:tcPr>
-          <w:p>
-            <w:pPr>
-              <w:rPr>
-                <w:rStyle w:val="QuelltextZeichen"/>
-              </w:rPr>
-            </w:pPr>
-          </w:p>
-        </w:tc>
-        <w:tc>
-          <w:tcPr>
-            <w:tcW w:w="1339" w:type="dxa"/>
-          </w:tcPr>
-          <w:p>
-            <w:pPr>
-              <w:rPr>
-                <w:rStyle w:val="QuelltextZeichen"/>
-              </w:rPr>
-            </w:pPr>
-            <w:r>
-              <w:rPr>
-                <w:rStyle w:val="QuelltextZeichen"/>
-              </w:rPr>
-              <w:t>replacement</w:t>
-            </w:r>
+            <w:tcW w:w="399" w:type="dxa"/>
+          </w:tcPr>
+          <w:p>
+            <w:pPr>
+              <w:rPr>
+                <w:rStyle w:val="QuelltextZeichen"/>
+              </w:rPr>
+            </w:pPr>
+          </w:p>
+        </w:tc>
+        <w:tc>
+          <w:tcPr>
+            <w:tcW w:w="1590" w:type="dxa"/>
+            <w:gridSpan w:val="2"/>
+          </w:tcPr>
+          <w:p>
+            <w:pPr>
+              <w:rPr>
+                <w:rStyle w:val="QuelltextZeichen"/>
+              </w:rPr>
+            </w:pPr>
           </w:p>
         </w:tc>
         <w:tc>
           <w:tcPr>
             <w:tcW w:w="1856" w:type="dxa"/>
-          </w:tcPr>
-          <w:p>
-            <w:proofErr w:type="spellStart"/>
-            <w:r>
-              <w:t>string</w:t>
-            </w:r>
-            <w:proofErr w:type="spellEnd"/>
-            <w:r>
-              <w:t xml:space="preserve"> | </w:t>
-            </w:r>
-            <w:proofErr w:type="spellStart"/>
-            <w:r>
-              <w:t>function</w:t>
-            </w:r>
-            <w:proofErr w:type="spellEnd"/>
-          </w:p>
-        </w:tc>
-        <w:tc>
-          <w:tcPr>
-            <w:tcW w:w="1322" w:type="dxa"/>
-            <w:gridSpan w:val="2"/>
-          </w:tcPr>
-          <w:p/>
-        </w:tc>
-        <w:tc>
-          <w:tcPr>
-            <w:tcW w:w="3895" w:type="dxa"/>
-            <w:gridSpan w:val="2"/>
-            <w:vMerge/>
-          </w:tcPr>
-          <w:p/>
-        </w:tc>
-      </w:tr>
-      <w:tr>
-        <w:trPr>
-          <w:cnfStyle w:val="000000100000" w:firstRow="0" w:lastRow="0" w:firstColumn="0" w:lastColumn="0" w:oddVBand="0" w:evenVBand="0" w:oddHBand="1" w:evenHBand="0" w:firstRowFirstColumn="0" w:firstRowLastColumn="0" w:lastRowFirstColumn="0" w:lastRowLastColumn="0"/>
-        </w:trPr>
-        <w:tc>
-          <w:tcPr>
-            <w:tcW w:w="399" w:type="dxa"/>
-          </w:tcPr>
-          <w:p>
-            <w:pPr>
-              <w:rPr>
-                <w:rStyle w:val="QuelltextZeichen"/>
-              </w:rPr>
-            </w:pPr>
-          </w:p>
-        </w:tc>
-        <w:tc>
-          <w:tcPr>
-            <w:tcW w:w="1590" w:type="dxa"/>
-            <w:gridSpan w:val="2"/>
-          </w:tcPr>
-          <w:p>
-            <w:pPr>
-              <w:rPr>
-                <w:rStyle w:val="QuelltextZeichen"/>
-              </w:rPr>
-            </w:pPr>
-          </w:p>
-        </w:tc>
-        <w:tc>
-          <w:tcPr>
-            <w:tcW w:w="1856" w:type="dxa"/>
+            <w:gridSpan w:val="2"/>
           </w:tcPr>
           <w:p/>
         </w:tc>
@@ -3406,13 +3398,8 @@
               <w:t>Callback(</w:t>
             </w:r>
             <w:proofErr w:type="spellStart"/>
-            <w:proofErr w:type="gramStart"/>
-            <w:r>
-              <w:t>element,index</w:t>
-            </w:r>
-            <w:proofErr w:type="gramEnd"/>
-            <w:r>
-              <w:t>,array</w:t>
+            <w:r>
+              <w:t>element,index,array</w:t>
             </w:r>
             <w:proofErr w:type="spellEnd"/>
             <w:r>
@@ -4551,18 +4538,13 @@
     </w:p>
     <w:p>
       <w:r>
-        <w:t xml:space="preserve">Im finalen Stylesheet werden diese Elemente expandiert und ggf. mit der </w:t>
-      </w:r>
-      <w:proofErr w:type="gramStart"/>
-      <w:r>
-        <w:t>Markierung !</w:t>
+        <w:t>Im finalen Stylesheet werden diese Elemente expandiert und ggf. mit der Markierung !</w:t>
       </w:r>
       <w:proofErr w:type="spellStart"/>
       <w:r>
         <w:t>important</w:t>
       </w:r>
       <w:proofErr w:type="spellEnd"/>
-      <w:proofErr w:type="gramEnd"/>
       <w:r>
         <w:t xml:space="preserve"> versehen.</w:t>
       </w:r>
@@ -4762,13 +4744,8 @@
             <w:tcW w:w="2265" w:type="dxa"/>
           </w:tcPr>
           <w:p>
-            <w:proofErr w:type="gramStart"/>
-            <w:r>
-              <w:t>.ok</w:t>
-            </w:r>
-            <w:proofErr w:type="gramEnd"/>
-            <w:r>
-              <w:t xml:space="preserve">-button </w:t>
+            <w:r>
+              <w:t xml:space="preserve">.ok-button </w:t>
             </w:r>
           </w:p>
         </w:tc>
@@ -4810,7 +4787,6 @@
             <w:tcW w:w="2265" w:type="dxa"/>
           </w:tcPr>
           <w:p>
-            <w:proofErr w:type="gramStart"/>
             <w:r>
               <w:t>.</w:t>
             </w:r>
@@ -4819,7 +4795,6 @@
               <w:t>cancel</w:t>
             </w:r>
             <w:proofErr w:type="spellEnd"/>
-            <w:proofErr w:type="gramEnd"/>
             <w:r>
               <w:t xml:space="preserve">-button </w:t>
             </w:r>
@@ -4866,13 +4841,8 @@
             <w:tcW w:w="2265" w:type="dxa"/>
           </w:tcPr>
           <w:p>
-            <w:proofErr w:type="gramStart"/>
-            <w:r>
-              <w:t>.neutral</w:t>
-            </w:r>
-            <w:proofErr w:type="gramEnd"/>
-            <w:r>
-              <w:t xml:space="preserve">-button </w:t>
+            <w:r>
+              <w:t xml:space="preserve">.neutral-button </w:t>
             </w:r>
           </w:p>
         </w:tc>
@@ -4914,13 +4884,8 @@
             <w:tcW w:w="2265" w:type="dxa"/>
           </w:tcPr>
           <w:p>
-            <w:proofErr w:type="gramStart"/>
-            <w:r>
-              <w:t>.neutral</w:t>
-            </w:r>
-            <w:proofErr w:type="gramEnd"/>
-            <w:r>
-              <w:t xml:space="preserve">2-button </w:t>
+            <w:r>
+              <w:t xml:space="preserve">.neutral2-button </w:t>
             </w:r>
           </w:p>
         </w:tc>
@@ -4965,7 +4930,6 @@
             <w:tcW w:w="2265" w:type="dxa"/>
           </w:tcPr>
           <w:p>
-            <w:proofErr w:type="gramStart"/>
             <w:r>
               <w:t>.</w:t>
             </w:r>
@@ -4974,7 +4938,6 @@
               <w:t>attention</w:t>
             </w:r>
             <w:proofErr w:type="spellEnd"/>
-            <w:proofErr w:type="gramEnd"/>
             <w:r>
               <w:t xml:space="preserve">-button </w:t>
             </w:r>
@@ -5018,7 +4981,6 @@
             <w:tcW w:w="2265" w:type="dxa"/>
           </w:tcPr>
           <w:p>
-            <w:proofErr w:type="gramStart"/>
             <w:r>
               <w:t>.</w:t>
             </w:r>
@@ -5027,7 +4989,6 @@
               <w:t>danger</w:t>
             </w:r>
             <w:proofErr w:type="spellEnd"/>
-            <w:proofErr w:type="gramEnd"/>
             <w:r>
               <w:t xml:space="preserve">-button </w:t>
             </w:r>
@@ -5074,13 +5035,8 @@
             <w:tcW w:w="2265" w:type="dxa"/>
           </w:tcPr>
           <w:p>
-            <w:proofErr w:type="gramStart"/>
-            <w:r>
-              <w:t>.disabled</w:t>
-            </w:r>
-            <w:proofErr w:type="gramEnd"/>
-            <w:r>
-              <w:t xml:space="preserve">-button </w:t>
+            <w:r>
+              <w:t xml:space="preserve">.disabled-button </w:t>
             </w:r>
           </w:p>
         </w:tc>
@@ -5402,60 +5358,330 @@
 </file>
 
 <file path=word/numbering.xml><?xml version="1.0" encoding="utf-8"?>
-<w:numbering xmlns:wpc="http://schemas.microsoft.com/office/word/2010/wordprocessingCanvas" xmlns:cx="http://schemas.microsoft.com/office/drawing/2014/chartex" xmlns:cx1="http://schemas.microsoft.com/office/drawing/2015/9/8/chartex" xmlns:cx2="http://schemas.microsoft.com/office/drawing/2015/10/21/chartex" xmlns:cx3="http://schemas.microsoft.com/office/drawing/2016/5/9/chartex" xmlns:cx4="http://schemas.microsoft.com/office/drawing/2016/5/10/chartex" xmlns:cx5="http://schemas.microsoft.com/office/drawing/2016/5/11/chartex" xmlns:cx6="http://schemas.microsoft.com/office/drawing/2016/5/12/chartex" xmlns:cx7="http://schemas.microsoft.com/office/drawing/2016/5/13/chartex" xmlns:cx8="http://schemas.microsoft.com/office/drawing/2016/5/14/chartex" xmlns:mc="http://schemas.openxmlformats.org/markup-compatibility/2006" xmlns:aink="http://schemas.microsoft.com/office/drawing/2016/ink" xmlns:am3d="http://schemas.microsoft.com/office/drawing/2017/model3d" xmlns:o="urn:schemas-microsoft-com:office:office" xmlns:oel="http://schemas.microsoft.com/office/2019/extlst" xmlns:r="http://schemas.openxmlformats.org/officeDocument/2006/relationships" xmlns:m="http://schemas.openxmlformats.org/officeDocument/2006/math" xmlns:v="urn:schemas-microsoft-com:vml" xmlns:wp14="http://schemas.microsoft.com/office/word/2010/wordprocessingDrawing" xmlns:wp="http://schemas.openxmlformats.org/drawingml/2006/wordprocessingDrawing" xmlns:w10="urn:schemas-microsoft-com:office:word" xmlns:w="http://schemas.openxmlformats.org/wordprocessingml/2006/main" xmlns:w14="http://schemas.microsoft.com/office/word/2010/wordml" xmlns:w15="http://schemas.microsoft.com/office/word/2012/wordml" xmlns:w16cex="http://schemas.microsoft.com/office/word/2018/wordml/cex" xmlns:w16cid="http://schemas.microsoft.com/office/word/2016/wordml/cid" xmlns:w16="http://schemas.microsoft.com/office/word/2018/wordml" xmlns:w16sdtdh="http://schemas.microsoft.com/office/word/2020/wordml/sdtdatahash" xmlns:w16se="http://schemas.microsoft.com/office/word/2015/wordml/symex" xmlns:wpg="http://schemas.microsoft.com/office/word/2010/wordprocessingGroup" xmlns:wpi="http://schemas.microsoft.com/office/word/2010/wordprocessingInk" xmlns:wne="http://schemas.microsoft.com/office/word/2006/wordml" xmlns:wps="http://schemas.microsoft.com/office/word/2010/wordprocessingShape" mc:Ignorable="w14 w15 w16se w16cid w16 w16cex w16sdtdh wp14">
+<w:numbering xmlns:wpc="http://schemas.microsoft.com/office/word/2010/wordprocessingCanvas" xmlns:cx="http://schemas.microsoft.com/office/drawing/2014/chartex" xmlns:cx1="http://schemas.microsoft.com/office/drawing/2015/9/8/chartex" xmlns:cx2="http://schemas.microsoft.com/office/drawing/2015/10/21/chartex" xmlns:cx3="http://schemas.microsoft.com/office/drawing/2016/5/9/chartex" xmlns:cx4="http://schemas.microsoft.com/office/drawing/2016/5/10/chartex" xmlns:cx5="http://schemas.microsoft.com/office/drawing/2016/5/11/chartex" xmlns:cx6="http://schemas.microsoft.com/office/drawing/2016/5/12/chartex" xmlns:cx7="http://schemas.microsoft.com/office/drawing/2016/5/13/chartex" xmlns:cx8="http://schemas.microsoft.com/office/drawing/2016/5/14/chartex" xmlns:mc="http://schemas.openxmlformats.org/markup-compatibility/2006" xmlns:aink="http://schemas.microsoft.com/office/drawing/2016/ink" xmlns:am3d="http://schemas.microsoft.com/office/drawing/2017/model3d" xmlns:o="urn:schemas-microsoft-com:office:office" xmlns:oel="http://schemas.microsoft.com/office/2019/extlst" xmlns:r="http://schemas.openxmlformats.org/officeDocument/2006/relationships" xmlns:m="http://schemas.openxmlformats.org/officeDocument/2006/math" xmlns:v="urn:schemas-microsoft-com:vml" xmlns:wp14="http://schemas.microsoft.com/office/word/2010/wordprocessingDrawing" xmlns:wp="http://schemas.openxmlformats.org/drawingml/2006/wordprocessingDrawing" xmlns:w10="urn:schemas-microsoft-com:office:word" xmlns:w="http://schemas.openxmlformats.org/wordprocessingml/2006/main" xmlns:w14="http://schemas.microsoft.com/office/word/2010/wordml" xmlns:w15="http://schemas.microsoft.com/office/word/2012/wordml" xmlns:w16cex="http://schemas.microsoft.com/office/word/2018/wordml/cex" xmlns:w16cid="http://schemas.microsoft.com/office/word/2016/wordml/cid" xmlns:w16="http://schemas.microsoft.com/office/word/2018/wordml" xmlns:w16du="http://schemas.microsoft.com/office/word/2023/wordml/word16du" xmlns:w16sdtdh="http://schemas.microsoft.com/office/word/2020/wordml/sdtdatahash" xmlns:w16sdtfl="http://schemas.microsoft.com/office/word/2024/wordml/sdtformatlock" xmlns:w16se="http://schemas.microsoft.com/office/word/2015/wordml/symex" xmlns:wpg="http://schemas.microsoft.com/office/word/2010/wordprocessingGroup" xmlns:wpi="http://schemas.microsoft.com/office/word/2010/wordprocessingInk" xmlns:wne="http://schemas.microsoft.com/office/word/2006/wordml" xmlns:wps="http://schemas.microsoft.com/office/word/2010/wordprocessingShape" mc:Ignorable="w14 w15 w16se w16cid w16 w16cex w16sdtdh w16sdtfl w16du wp14">
   <w:numPicBullet w:numPicBulletId="0">
-    <w:pict>
-      <v:shapetype id="_x0000_t75" coordsize="21600,21600" o:spt="75" o:preferrelative="t" path="m@4@5l@4@11@9@11@9@5xe" filled="f" stroked="f">
-        <v:stroke joinstyle="miter"/>
-        <v:formulas>
-          <v:f eqn="if lineDrawn pixelLineWidth 0"/>
-          <v:f eqn="sum @0 1 0"/>
-          <v:f eqn="sum 0 0 @1"/>
-          <v:f eqn="prod @2 1 2"/>
-          <v:f eqn="prod @3 21600 pixelWidth"/>
-          <v:f eqn="prod @3 21600 pixelHeight"/>
-          <v:f eqn="sum @0 0 1"/>
-          <v:f eqn="prod @6 1 2"/>
-          <v:f eqn="prod @7 21600 pixelWidth"/>
-          <v:f eqn="sum @8 21600 0"/>
-          <v:f eqn="prod @7 21600 pixelHeight"/>
-          <v:f eqn="sum @10 21600 0"/>
-        </v:formulas>
-        <v:path o:extrusionok="f" gradientshapeok="t" o:connecttype="rect"/>
-        <o:lock v:ext="edit" aspectratio="t"/>
-      </v:shapetype>
-      <v:shape id="_x0000_i1091" type="#_x0000_t75" alt="Beschreibung: D:\Projekte\Word-UI\Icons\FrageB.png" style="width:14.2pt;height:14.2pt;visibility:visible;mso-wrap-style:square" o:bullet="t">
-        <v:imagedata r:id="rId1" o:title="FrageB"/>
-      </v:shape>
-    </w:pict>
+    <mc:AlternateContent>
+      <mc:Choice Requires="v">
+        <w:pict>
+          <v:shapetype w14:anchorId="2A5C5E66" id="_x0000_t75" coordsize="21600,21600" o:spt="75" o:preferrelative="t" path="m@4@5l@4@11@9@11@9@5xe" filled="f" stroked="f">
+            <v:stroke joinstyle="miter"/>
+            <v:formulas>
+              <v:f eqn="if lineDrawn pixelLineWidth 0"/>
+              <v:f eqn="sum @0 1 0"/>
+              <v:f eqn="sum 0 0 @1"/>
+              <v:f eqn="prod @2 1 2"/>
+              <v:f eqn="prod @3 21600 pixelWidth"/>
+              <v:f eqn="prod @3 21600 pixelHeight"/>
+              <v:f eqn="sum @0 0 1"/>
+              <v:f eqn="prod @6 1 2"/>
+              <v:f eqn="prod @7 21600 pixelWidth"/>
+              <v:f eqn="sum @8 21600 0"/>
+              <v:f eqn="prod @7 21600 pixelHeight"/>
+              <v:f eqn="sum @10 21600 0"/>
+            </v:formulas>
+            <v:path o:extrusionok="f" gradientshapeok="t" o:connecttype="rect"/>
+            <o:lock v:ext="edit" aspectratio="t"/>
+          </v:shapetype>
+          <v:shape id="Grafik 1506227760" o:spid="_x0000_i1025" type="#_x0000_t75" style="width:14.4pt;height:14.4pt;visibility:visible;mso-wrap-style:square">
+            <v:imagedata r:id="rId1" o:title=""/>
+          </v:shape>
+        </w:pict>
+      </mc:Choice>
+      <mc:Fallback>
+        <w:drawing>
+          <wp:inline distT="0" distB="0" distL="0" distR="0" wp14:anchorId="25F9A466" wp14:editId="7524AE6D">
+            <wp:extent cx="182880" cy="182880"/>
+            <wp:effectExtent l="0" t="0" r="0" b="0"/>
+            <wp:docPr id="1506227760" name="Grafik 1506227760"/>
+            <wp:cNvGraphicFramePr>
+              <a:graphicFrameLocks xmlns:a="http://schemas.openxmlformats.org/drawingml/2006/main" noChangeAspect="1"/>
+            </wp:cNvGraphicFramePr>
+            <a:graphic xmlns:a="http://schemas.openxmlformats.org/drawingml/2006/main">
+              <a:graphicData uri="http://schemas.openxmlformats.org/drawingml/2006/picture">
+                <pic:pic xmlns:pic="http://schemas.openxmlformats.org/drawingml/2006/picture">
+                  <pic:nvPicPr>
+                    <pic:cNvPr id="0" name="Picture -1023"/>
+                    <pic:cNvPicPr>
+                      <a:picLocks noChangeAspect="1" noChangeArrowheads="1"/>
+                    </pic:cNvPicPr>
+                  </pic:nvPicPr>
+                  <pic:blipFill>
+                    <a:blip r:embed="rId2">
+                      <a:extLst>
+                        <a:ext uri="{28A0092B-C50C-407E-A947-70E740481C1C}">
+                          <a14:useLocalDpi xmlns:a14="http://schemas.microsoft.com/office/drawing/2010/main" val="0"/>
+                        </a:ext>
+                      </a:extLst>
+                    </a:blip>
+                    <a:srcRect/>
+                    <a:stretch>
+                      <a:fillRect/>
+                    </a:stretch>
+                  </pic:blipFill>
+                  <pic:spPr bwMode="auto">
+                    <a:xfrm>
+                      <a:off x="0" y="0"/>
+                      <a:ext cx="182880" cy="182880"/>
+                    </a:xfrm>
+                    <a:prstGeom prst="rect">
+                      <a:avLst/>
+                    </a:prstGeom>
+                    <a:noFill/>
+                    <a:ln>
+                      <a:noFill/>
+                    </a:ln>
+                  </pic:spPr>
+                </pic:pic>
+              </a:graphicData>
+            </a:graphic>
+          </wp:inline>
+        </w:drawing>
+      </mc:Fallback>
+    </mc:AlternateContent>
   </w:numPicBullet>
   <w:numPicBullet w:numPicBulletId="1">
-    <w:pict>
-      <v:shape id="_x0000_i1092" type="#_x0000_t75" alt="Beschreibung: D:\Projekte\Word-UI\Icons\Verboten.png" style="width:11.45pt;height:11.45pt;visibility:visible;mso-wrap-style:square" o:bullet="t">
-        <v:imagedata r:id="rId2" o:title="Verboten"/>
-      </v:shape>
-    </w:pict>
+    <mc:AlternateContent>
+      <mc:Choice Requires="v">
+        <w:pict>
+          <v:shape w14:anchorId="03EA25B7" id="Grafik 335118753" o:spid="_x0000_i1025" type="#_x0000_t75" style="width:11.4pt;height:11.4pt;visibility:visible;mso-wrap-style:square">
+            <v:imagedata r:id="rId3" o:title=""/>
+          </v:shape>
+        </w:pict>
+      </mc:Choice>
+      <mc:Fallback>
+        <w:drawing>
+          <wp:inline distT="0" distB="0" distL="0" distR="0" wp14:anchorId="1B446F7B" wp14:editId="2B757A1B">
+            <wp:extent cx="144780" cy="144780"/>
+            <wp:effectExtent l="0" t="0" r="0" b="0"/>
+            <wp:docPr id="335118753" name="Grafik 335118753"/>
+            <wp:cNvGraphicFramePr>
+              <a:graphicFrameLocks xmlns:a="http://schemas.openxmlformats.org/drawingml/2006/main" noChangeAspect="1"/>
+            </wp:cNvGraphicFramePr>
+            <a:graphic xmlns:a="http://schemas.openxmlformats.org/drawingml/2006/main">
+              <a:graphicData uri="http://schemas.openxmlformats.org/drawingml/2006/picture">
+                <pic:pic xmlns:pic="http://schemas.openxmlformats.org/drawingml/2006/picture">
+                  <pic:nvPicPr>
+                    <pic:cNvPr id="0" name="Picture -1022"/>
+                    <pic:cNvPicPr>
+                      <a:picLocks noChangeAspect="1" noChangeArrowheads="1"/>
+                    </pic:cNvPicPr>
+                  </pic:nvPicPr>
+                  <pic:blipFill>
+                    <a:blip r:embed="rId4">
+                      <a:extLst>
+                        <a:ext uri="{28A0092B-C50C-407E-A947-70E740481C1C}">
+                          <a14:useLocalDpi xmlns:a14="http://schemas.microsoft.com/office/drawing/2010/main" val="0"/>
+                        </a:ext>
+                      </a:extLst>
+                    </a:blip>
+                    <a:srcRect/>
+                    <a:stretch>
+                      <a:fillRect/>
+                    </a:stretch>
+                  </pic:blipFill>
+                  <pic:spPr bwMode="auto">
+                    <a:xfrm>
+                      <a:off x="0" y="0"/>
+                      <a:ext cx="144780" cy="144780"/>
+                    </a:xfrm>
+                    <a:prstGeom prst="rect">
+                      <a:avLst/>
+                    </a:prstGeom>
+                    <a:noFill/>
+                    <a:ln>
+                      <a:noFill/>
+                    </a:ln>
+                  </pic:spPr>
+                </pic:pic>
+              </a:graphicData>
+            </a:graphic>
+          </wp:inline>
+        </w:drawing>
+      </mc:Fallback>
+    </mc:AlternateContent>
   </w:numPicBullet>
   <w:numPicBullet w:numPicBulletId="2">
-    <w:pict>
-      <v:shape id="_x0000_i1093" type="#_x0000_t75" alt="Beschreibung: 120px-Crystal_Clear_action_info" style="width:14.2pt;height:14.2pt;visibility:visible;mso-wrap-style:square" o:bullet="t">
-        <v:imagedata r:id="rId3" o:title="120px-Crystal_Clear_action_info"/>
-      </v:shape>
-    </w:pict>
+    <mc:AlternateContent>
+      <mc:Choice Requires="v">
+        <w:pict>
+          <v:shape w14:anchorId="172B8BA2" id="Grafik 1654788923" o:spid="_x0000_i1025" type="#_x0000_t75" alt="Beschreibung: 120px-Crystal_Clear_action_info" style="width:14.4pt;height:14.4pt;visibility:visible;mso-wrap-style:square">
+            <v:imagedata r:id="rId5" o:title=" 120px-Crystal_Clear_action_info"/>
+          </v:shape>
+        </w:pict>
+      </mc:Choice>
+      <mc:Fallback>
+        <w:drawing>
+          <wp:inline distT="0" distB="0" distL="0" distR="0" wp14:anchorId="54DA2F08" wp14:editId="514B1BD9">
+            <wp:extent cx="182880" cy="182880"/>
+            <wp:effectExtent l="0" t="0" r="0" b="0"/>
+            <wp:docPr id="1654788923" name="Grafik 1654788923" descr="Beschreibung: 120px-Crystal_Clear_action_info"/>
+            <wp:cNvGraphicFramePr>
+              <a:graphicFrameLocks xmlns:a="http://schemas.openxmlformats.org/drawingml/2006/main" noChangeAspect="1"/>
+            </wp:cNvGraphicFramePr>
+            <a:graphic xmlns:a="http://schemas.openxmlformats.org/drawingml/2006/main">
+              <a:graphicData uri="http://schemas.openxmlformats.org/drawingml/2006/picture">
+                <pic:pic xmlns:pic="http://schemas.openxmlformats.org/drawingml/2006/picture">
+                  <pic:nvPicPr>
+                    <pic:cNvPr id="0" name="Picture -1021" descr="Beschreibung: 120px-Crystal_Clear_action_info"/>
+                    <pic:cNvPicPr>
+                      <a:picLocks noChangeAspect="1" noChangeArrowheads="1"/>
+                    </pic:cNvPicPr>
+                  </pic:nvPicPr>
+                  <pic:blipFill>
+                    <a:blip r:embed="rId6">
+                      <a:extLst>
+                        <a:ext uri="{28A0092B-C50C-407E-A947-70E740481C1C}">
+                          <a14:useLocalDpi xmlns:a14="http://schemas.microsoft.com/office/drawing/2010/main" val="0"/>
+                        </a:ext>
+                      </a:extLst>
+                    </a:blip>
+                    <a:srcRect/>
+                    <a:stretch>
+                      <a:fillRect/>
+                    </a:stretch>
+                  </pic:blipFill>
+                  <pic:spPr bwMode="auto">
+                    <a:xfrm>
+                      <a:off x="0" y="0"/>
+                      <a:ext cx="182880" cy="182880"/>
+                    </a:xfrm>
+                    <a:prstGeom prst="rect">
+                      <a:avLst/>
+                    </a:prstGeom>
+                    <a:noFill/>
+                    <a:ln>
+                      <a:noFill/>
+                    </a:ln>
+                  </pic:spPr>
+                </pic:pic>
+              </a:graphicData>
+            </a:graphic>
+          </wp:inline>
+        </w:drawing>
+      </mc:Fallback>
+    </mc:AlternateContent>
   </w:numPicBullet>
   <w:numPicBullet w:numPicBulletId="3">
-    <w:pict>
-      <v:shape id="_x0000_i1094" type="#_x0000_t75" alt="Beschreibung: 120px-Nuvola_apps_important" style="width:90pt;height:75.1pt;visibility:visible;mso-wrap-style:square;mso-width-percent:0;mso-height-percent:0;mso-wrap-distance-left:9pt;mso-wrap-distance-top:0;mso-wrap-distance-right:9pt;mso-wrap-distance-bottom:0;mso-position-horizontal:right;mso-position-horizontal-relative:page;mso-position-vertical:absolute;mso-position-vertical-relative:text;mso-width-percent:0;mso-height-percent:0;mso-width-relative:page;mso-height-relative:page" o:allowincell="f" o:bullet="t">
-        <v:imagedata r:id="rId4" o:title="120px-Nuvola_apps_important"/>
-      </v:shape>
-    </w:pict>
+    <mc:AlternateContent>
+      <mc:Choice Requires="v">
+        <w:pict>
+          <v:shape w14:anchorId="1D72E0F0" id="Grafik 1236923483" o:spid="_x0000_i1025" type="#_x0000_t75" alt="Beschreibung: 120px-Nuvola_apps_important" style="width:90pt;height:75pt;visibility:visible;mso-wrap-style:square">
+            <v:imagedata r:id="rId7" o:title=" 120px-Nuvola_apps_important"/>
+          </v:shape>
+        </w:pict>
+      </mc:Choice>
+      <mc:Fallback>
+        <w:drawing>
+          <wp:inline distT="0" distB="0" distL="0" distR="0" wp14:anchorId="49783AC9" wp14:editId="2473FA87">
+            <wp:extent cx="1143000" cy="952500"/>
+            <wp:effectExtent l="0" t="0" r="0" b="0"/>
+            <wp:docPr id="1236923483" name="Grafik 1236923483" descr="Beschreibung: 120px-Nuvola_apps_important"/>
+            <wp:cNvGraphicFramePr>
+              <a:graphicFrameLocks xmlns:a="http://schemas.openxmlformats.org/drawingml/2006/main" noChangeAspect="1"/>
+            </wp:cNvGraphicFramePr>
+            <a:graphic xmlns:a="http://schemas.openxmlformats.org/drawingml/2006/main">
+              <a:graphicData uri="http://schemas.openxmlformats.org/drawingml/2006/picture">
+                <pic:pic xmlns:pic="http://schemas.openxmlformats.org/drawingml/2006/picture">
+                  <pic:nvPicPr>
+                    <pic:cNvPr id="0" name="Picture -1020" descr="Beschreibung: 120px-Nuvola_apps_important"/>
+                    <pic:cNvPicPr>
+                      <a:picLocks noChangeAspect="1" noChangeArrowheads="1"/>
+                    </pic:cNvPicPr>
+                  </pic:nvPicPr>
+                  <pic:blipFill>
+                    <a:blip r:embed="rId8">
+                      <a:extLst>
+                        <a:ext uri="{28A0092B-C50C-407E-A947-70E740481C1C}">
+                          <a14:useLocalDpi xmlns:a14="http://schemas.microsoft.com/office/drawing/2010/main" val="0"/>
+                        </a:ext>
+                      </a:extLst>
+                    </a:blip>
+                    <a:srcRect/>
+                    <a:stretch>
+                      <a:fillRect/>
+                    </a:stretch>
+                  </pic:blipFill>
+                  <pic:spPr bwMode="auto">
+                    <a:xfrm>
+                      <a:off x="0" y="0"/>
+                      <a:ext cx="1143000" cy="952500"/>
+                    </a:xfrm>
+                    <a:prstGeom prst="rect">
+                      <a:avLst/>
+                    </a:prstGeom>
+                    <a:noFill/>
+                    <a:ln>
+                      <a:noFill/>
+                    </a:ln>
+                  </pic:spPr>
+                </pic:pic>
+              </a:graphicData>
+            </a:graphic>
+          </wp:inline>
+        </w:drawing>
+      </mc:Fallback>
+    </mc:AlternateContent>
   </w:numPicBullet>
   <w:numPicBullet w:numPicBulletId="4">
-    <w:pict>
-      <v:shape id="_x0000_i1095" type="#_x0000_t75" alt="Beschreibung: 120px-Crystal_Clear_app_ktip" style="width:14.2pt;height:14.2pt;visibility:visible;mso-wrap-style:square" o:bullet="t">
-        <v:imagedata r:id="rId5" o:title="120px-Crystal_Clear_app_ktip"/>
-      </v:shape>
-    </w:pict>
+    <mc:AlternateContent>
+      <mc:Choice Requires="v">
+        <w:pict>
+          <v:shape w14:anchorId="53605157" id="Grafik 645831701" o:spid="_x0000_i1025" type="#_x0000_t75" alt="Beschreibung: 120px-Crystal_Clear_app_ktip" style="width:14.4pt;height:14.4pt;visibility:visible;mso-wrap-style:square">
+            <v:imagedata r:id="rId9" o:title=" 120px-Crystal_Clear_app_ktip"/>
+          </v:shape>
+        </w:pict>
+      </mc:Choice>
+      <mc:Fallback>
+        <w:drawing>
+          <wp:inline distT="0" distB="0" distL="0" distR="0" wp14:anchorId="105EC7CA" wp14:editId="1F235372">
+            <wp:extent cx="182880" cy="182880"/>
+            <wp:effectExtent l="0" t="0" r="0" b="0"/>
+            <wp:docPr id="645831701" name="Grafik 645831701" descr="Beschreibung: 120px-Crystal_Clear_app_ktip"/>
+            <wp:cNvGraphicFramePr>
+              <a:graphicFrameLocks xmlns:a="http://schemas.openxmlformats.org/drawingml/2006/main" noChangeAspect="1"/>
+            </wp:cNvGraphicFramePr>
+            <a:graphic xmlns:a="http://schemas.openxmlformats.org/drawingml/2006/main">
+              <a:graphicData uri="http://schemas.openxmlformats.org/drawingml/2006/picture">
+                <pic:pic xmlns:pic="http://schemas.openxmlformats.org/drawingml/2006/picture">
+                  <pic:nvPicPr>
+                    <pic:cNvPr id="0" name="Picture -1019" descr="Beschreibung: 120px-Crystal_Clear_app_ktip"/>
+                    <pic:cNvPicPr>
+                      <a:picLocks noChangeAspect="1" noChangeArrowheads="1"/>
+                    </pic:cNvPicPr>
+                  </pic:nvPicPr>
+                  <pic:blipFill>
+                    <a:blip r:embed="rId10">
+                      <a:extLst>
+                        <a:ext uri="{28A0092B-C50C-407E-A947-70E740481C1C}">
+                          <a14:useLocalDpi xmlns:a14="http://schemas.microsoft.com/office/drawing/2010/main" val="0"/>
+                        </a:ext>
+                      </a:extLst>
+                    </a:blip>
+                    <a:srcRect/>
+                    <a:stretch>
+                      <a:fillRect/>
+                    </a:stretch>
+                  </pic:blipFill>
+                  <pic:spPr bwMode="auto">
+                    <a:xfrm>
+                      <a:off x="0" y="0"/>
+                      <a:ext cx="182880" cy="182880"/>
+                    </a:xfrm>
+                    <a:prstGeom prst="rect">
+                      <a:avLst/>
+                    </a:prstGeom>
+                    <a:noFill/>
+                    <a:ln>
+                      <a:noFill/>
+                    </a:ln>
+                  </pic:spPr>
+                </pic:pic>
+              </a:graphicData>
+            </a:graphic>
+          </wp:inline>
+        </w:drawing>
+      </mc:Fallback>
+    </mc:AlternateContent>
   </w:numPicBullet>
   <w:abstractNum w:abstractNumId="0" w15:restartNumberingAfterBreak="0">
     <w:nsid w:val="FFFFFF7C"/>
@@ -6902,7 +7128,7 @@
 </file>
 
 <file path=word/styles.xml><?xml version="1.0" encoding="utf-8"?>
-<w:styles xmlns:mc="http://schemas.openxmlformats.org/markup-compatibility/2006" xmlns:r="http://schemas.openxmlformats.org/officeDocument/2006/relationships" xmlns:w="http://schemas.openxmlformats.org/wordprocessingml/2006/main" xmlns:w14="http://schemas.microsoft.com/office/word/2010/wordml" xmlns:w15="http://schemas.microsoft.com/office/word/2012/wordml" xmlns:w16cex="http://schemas.microsoft.com/office/word/2018/wordml/cex" xmlns:w16cid="http://schemas.microsoft.com/office/word/2016/wordml/cid" xmlns:w16="http://schemas.microsoft.com/office/word/2018/wordml" xmlns:w16sdtdh="http://schemas.microsoft.com/office/word/2020/wordml/sdtdatahash" xmlns:w16se="http://schemas.microsoft.com/office/word/2015/wordml/symex" mc:Ignorable="w14 w15 w16se w16cid w16 w16cex w16sdtdh">
+<w:styles xmlns:mc="http://schemas.openxmlformats.org/markup-compatibility/2006" xmlns:r="http://schemas.openxmlformats.org/officeDocument/2006/relationships" xmlns:w="http://schemas.openxmlformats.org/wordprocessingml/2006/main" xmlns:w14="http://schemas.microsoft.com/office/word/2010/wordml" xmlns:w15="http://schemas.microsoft.com/office/word/2012/wordml" xmlns:w16cex="http://schemas.microsoft.com/office/word/2018/wordml/cex" xmlns:w16cid="http://schemas.microsoft.com/office/word/2016/wordml/cid" xmlns:w16="http://schemas.microsoft.com/office/word/2018/wordml" xmlns:w16du="http://schemas.microsoft.com/office/word/2023/wordml/word16du" xmlns:w16sdtdh="http://schemas.microsoft.com/office/word/2020/wordml/sdtdatahash" xmlns:w16sdtfl="http://schemas.microsoft.com/office/word/2024/wordml/sdtformatlock" xmlns:w16se="http://schemas.microsoft.com/office/word/2015/wordml/symex" mc:Ignorable="w14 w15 w16se w16cid w16 w16cex w16sdtdh w16sdtfl w16du">
   <w:docDefaults>
     <w:rPrDefault>
       <w:rPr>

</xml_diff>

<commit_message>
synchronized Readout over multiple GM projects + automatic language detection + some UI improvements + deleting old stuff
</commit_message>
<xml_diff>
--- a/doc/doku.docx
+++ b/doc/doku.docx
@@ -99,7 +99,22 @@
       </w:r>
       <w:r>
         <w:br/>
-        <w:t xml:space="preserve">Hier werden alle UI Erweiterungen, wie z.B. Key-Handler oder </w:t>
+      </w:r>
+      <w:proofErr w:type="gramStart"/>
+      <w:r>
+        <w:t>Hier</w:t>
+      </w:r>
+      <w:proofErr w:type="gramEnd"/>
+      <w:r>
+        <w:t xml:space="preserve"> werden alle </w:t>
+      </w:r>
+      <w:proofErr w:type="gramStart"/>
+      <w:r>
+        <w:t>UI Erweiterungen</w:t>
+      </w:r>
+      <w:proofErr w:type="gramEnd"/>
+      <w:r>
+        <w:t xml:space="preserve">, wie z.B. Key-Handler oder </w:t>
       </w:r>
       <w:proofErr w:type="spellStart"/>
       <w:r>
@@ -1395,6 +1410,14 @@
             <w:r>
               <w:t xml:space="preserve"> | Array</w:t>
             </w:r>
+            <w:r>
+              <w:t xml:space="preserve"> | </w:t>
+            </w:r>
+            <w:proofErr w:type="spellStart"/>
+            <w:r>
+              <w:t>true</w:t>
+            </w:r>
+            <w:proofErr w:type="spellEnd"/>
           </w:p>
         </w:tc>
         <w:tc>
@@ -1421,6 +1444,35 @@
             <w:proofErr w:type="spellEnd"/>
             <w:r>
               <w:t>(en) für zu ignorierende Unterelemente</w:t>
+            </w:r>
+            <w:r>
+              <w:t xml:space="preserve">. </w:t>
+            </w:r>
+          </w:p>
+          <w:p>
+            <w:r>
+              <w:t xml:space="preserve">Oder </w:t>
+            </w:r>
+            <w:proofErr w:type="spellStart"/>
+            <w:proofErr w:type="gramStart"/>
+            <w:r>
+              <w:rPr>
+                <w:rStyle w:val="Hervorhebung"/>
+              </w:rPr>
+              <w:t>true</w:t>
+            </w:r>
+            <w:proofErr w:type="spellEnd"/>
+            <w:proofErr w:type="gramEnd"/>
+            <w:r>
+              <w:t xml:space="preserve"> um das Element und alle </w:t>
+            </w:r>
+            <w:proofErr w:type="spellStart"/>
+            <w:r>
+              <w:t>Unterlemente</w:t>
+            </w:r>
+            <w:proofErr w:type="spellEnd"/>
+            <w:r>
+              <w:t xml:space="preserve"> zu ignorieren.</w:t>
             </w:r>
           </w:p>
         </w:tc>
@@ -1543,10 +1595,20 @@
               <w:t>{</w:t>
             </w:r>
             <w:proofErr w:type="spellStart"/>
-            <w:r>
-              <w:t>text,pitch,rate,volume</w:t>
+            <w:proofErr w:type="gramStart"/>
+            <w:r>
+              <w:t>text,pitch</w:t>
+            </w:r>
+            <w:proofErr w:type="gramEnd"/>
+            <w:r>
+              <w:t>,</w:t>
+            </w:r>
+            <w:proofErr w:type="gramStart"/>
+            <w:r>
+              <w:t>rate,volume</w:t>
             </w:r>
             <w:proofErr w:type="spellEnd"/>
+            <w:proofErr w:type="gramEnd"/>
             <w:r>
               <w:t>}</w:t>
             </w:r>
@@ -1563,10 +1625,20 @@
               <w:t>[{</w:t>
             </w:r>
             <w:proofErr w:type="spellStart"/>
-            <w:r>
-              <w:t>text,pitch,rate,volume</w:t>
+            <w:proofErr w:type="gramStart"/>
+            <w:r>
+              <w:t>text,pitch</w:t>
+            </w:r>
+            <w:proofErr w:type="gramEnd"/>
+            <w:r>
+              <w:t>,</w:t>
+            </w:r>
+            <w:proofErr w:type="gramStart"/>
+            <w:r>
+              <w:t>rate,volume</w:t>
             </w:r>
             <w:proofErr w:type="spellEnd"/>
+            <w:proofErr w:type="gramEnd"/>
             <w:r>
               <w:t>}, …]</w:t>
             </w:r>
@@ -1632,13 +1704,26 @@
               <w:t>node</w:t>
             </w:r>
             <w:proofErr w:type="spellEnd"/>
-            <w:r>
-              <w:t>){…}</w:t>
-            </w:r>
-          </w:p>
-          <w:p>
-            <w:r>
-              <w:t>Definiert wird, stehen  innerhalb der Funktion die Methoden</w:t>
+            <w:proofErr w:type="gramStart"/>
+            <w:r>
+              <w:t>){</w:t>
+            </w:r>
+            <w:proofErr w:type="gramEnd"/>
+            <w:r>
+              <w:t>…}</w:t>
+            </w:r>
+          </w:p>
+          <w:p>
+            <w:r>
+              <w:t xml:space="preserve">Definiert wird, </w:t>
+            </w:r>
+            <w:proofErr w:type="gramStart"/>
+            <w:r>
+              <w:t>stehen  innerhalb</w:t>
+            </w:r>
+            <w:proofErr w:type="gramEnd"/>
+            <w:r>
+              <w:t xml:space="preserve"> der Funktion die Methoden</w:t>
             </w:r>
           </w:p>
           <w:p>
@@ -1672,10 +1757,12 @@
               <w:tab/>
             </w:r>
             <w:proofErr w:type="spellStart"/>
+            <w:proofErr w:type="gramStart"/>
             <w:r>
               <w:t>this.format</w:t>
             </w:r>
             <w:proofErr w:type="spellEnd"/>
+            <w:proofErr w:type="gramEnd"/>
           </w:p>
           <w:p>
             <w:r>
@@ -1763,6 +1850,7 @@
             <w:r>
               <w:t xml:space="preserve">und </w:t>
             </w:r>
+            <w:proofErr w:type="gramStart"/>
             <w:r>
               <w:rPr>
                 <w:rStyle w:val="QuelltextZeichen"/>
@@ -1770,7 +1858,11 @@
               <w:t>replacement</w:t>
             </w:r>
             <w:r>
-              <w:t xml:space="preserve">, oder ein Array mit entsprechenden Objekten. Siehe </w:t>
+              <w:t>,</w:t>
+            </w:r>
+            <w:proofErr w:type="gramEnd"/>
+            <w:r>
+              <w:t xml:space="preserve"> oder ein Array mit entsprechenden Objekten. Siehe </w:t>
             </w:r>
             <w:r>
               <w:rPr>
@@ -2663,6 +2755,7 @@
             <w:r>
               <w:t xml:space="preserve">und </w:t>
             </w:r>
+            <w:proofErr w:type="gramStart"/>
             <w:r>
               <w:rPr>
                 <w:rStyle w:val="QuelltextZeichen"/>
@@ -2670,7 +2763,11 @@
               <w:t>replacement</w:t>
             </w:r>
             <w:r>
-              <w:t xml:space="preserve">, oder ein Array mit ebensolchen Objekten. Siehe </w:t>
+              <w:t>,</w:t>
+            </w:r>
+            <w:proofErr w:type="gramEnd"/>
+            <w:r>
+              <w:t xml:space="preserve"> oder ein Array mit ebensolchen Objekten. Siehe </w:t>
             </w:r>
             <w:r>
               <w:rPr>
@@ -3398,8 +3495,13 @@
               <w:t>Callback(</w:t>
             </w:r>
             <w:proofErr w:type="spellStart"/>
-            <w:r>
-              <w:t>element,index,array</w:t>
+            <w:proofErr w:type="gramStart"/>
+            <w:r>
+              <w:t>element,index</w:t>
+            </w:r>
+            <w:proofErr w:type="gramEnd"/>
+            <w:r>
+              <w:t>,array</w:t>
             </w:r>
             <w:proofErr w:type="spellEnd"/>
             <w:r>
@@ -4187,6 +4289,7 @@
           </w:tcPr>
           <w:p>
             <w:r>
+              <w:lastRenderedPageBreak/>
               <w:t>--neutral2-button</w:t>
             </w:r>
           </w:p>
@@ -4258,7 +4361,6 @@
           </w:tcPr>
           <w:p>
             <w:r>
-              <w:lastRenderedPageBreak/>
               <w:t>--</w:t>
             </w:r>
             <w:proofErr w:type="spellStart"/>
@@ -4538,13 +4640,18 @@
     </w:p>
     <w:p>
       <w:r>
-        <w:t>Im finalen Stylesheet werden diese Elemente expandiert und ggf. mit der Markierung !</w:t>
+        <w:t xml:space="preserve">Im finalen Stylesheet werden diese Elemente expandiert und ggf. mit der </w:t>
+      </w:r>
+      <w:proofErr w:type="gramStart"/>
+      <w:r>
+        <w:t>Markierung !</w:t>
       </w:r>
       <w:proofErr w:type="spellStart"/>
       <w:r>
         <w:t>important</w:t>
       </w:r>
       <w:proofErr w:type="spellEnd"/>
+      <w:proofErr w:type="gramEnd"/>
       <w:r>
         <w:t xml:space="preserve"> versehen.</w:t>
       </w:r>
@@ -4744,8 +4851,13 @@
             <w:tcW w:w="2265" w:type="dxa"/>
           </w:tcPr>
           <w:p>
-            <w:r>
-              <w:t xml:space="preserve">.ok-button </w:t>
+            <w:proofErr w:type="gramStart"/>
+            <w:r>
+              <w:t>.ok</w:t>
+            </w:r>
+            <w:proofErr w:type="gramEnd"/>
+            <w:r>
+              <w:t xml:space="preserve">-button </w:t>
             </w:r>
           </w:p>
         </w:tc>
@@ -4787,6 +4899,7 @@
             <w:tcW w:w="2265" w:type="dxa"/>
           </w:tcPr>
           <w:p>
+            <w:proofErr w:type="gramStart"/>
             <w:r>
               <w:t>.</w:t>
             </w:r>
@@ -4795,6 +4908,7 @@
               <w:t>cancel</w:t>
             </w:r>
             <w:proofErr w:type="spellEnd"/>
+            <w:proofErr w:type="gramEnd"/>
             <w:r>
               <w:t xml:space="preserve">-button </w:t>
             </w:r>
@@ -4841,8 +4955,13 @@
             <w:tcW w:w="2265" w:type="dxa"/>
           </w:tcPr>
           <w:p>
-            <w:r>
-              <w:t xml:space="preserve">.neutral-button </w:t>
+            <w:proofErr w:type="gramStart"/>
+            <w:r>
+              <w:t>.neutral</w:t>
+            </w:r>
+            <w:proofErr w:type="gramEnd"/>
+            <w:r>
+              <w:t xml:space="preserve">-button </w:t>
             </w:r>
           </w:p>
         </w:tc>
@@ -4884,8 +5003,13 @@
             <w:tcW w:w="2265" w:type="dxa"/>
           </w:tcPr>
           <w:p>
-            <w:r>
-              <w:t xml:space="preserve">.neutral2-button </w:t>
+            <w:proofErr w:type="gramStart"/>
+            <w:r>
+              <w:t>.neutral</w:t>
+            </w:r>
+            <w:proofErr w:type="gramEnd"/>
+            <w:r>
+              <w:t xml:space="preserve">2-button </w:t>
             </w:r>
           </w:p>
         </w:tc>
@@ -4930,6 +5054,7 @@
             <w:tcW w:w="2265" w:type="dxa"/>
           </w:tcPr>
           <w:p>
+            <w:proofErr w:type="gramStart"/>
             <w:r>
               <w:t>.</w:t>
             </w:r>
@@ -4938,6 +5063,7 @@
               <w:t>attention</w:t>
             </w:r>
             <w:proofErr w:type="spellEnd"/>
+            <w:proofErr w:type="gramEnd"/>
             <w:r>
               <w:t xml:space="preserve">-button </w:t>
             </w:r>
@@ -4981,6 +5107,7 @@
             <w:tcW w:w="2265" w:type="dxa"/>
           </w:tcPr>
           <w:p>
+            <w:proofErr w:type="gramStart"/>
             <w:r>
               <w:t>.</w:t>
             </w:r>
@@ -4989,6 +5116,7 @@
               <w:t>danger</w:t>
             </w:r>
             <w:proofErr w:type="spellEnd"/>
+            <w:proofErr w:type="gramEnd"/>
             <w:r>
               <w:t xml:space="preserve">-button </w:t>
             </w:r>
@@ -5035,8 +5163,13 @@
             <w:tcW w:w="2265" w:type="dxa"/>
           </w:tcPr>
           <w:p>
-            <w:r>
-              <w:t xml:space="preserve">.disabled-button </w:t>
+            <w:proofErr w:type="gramStart"/>
+            <w:r>
+              <w:t>.disabled</w:t>
+            </w:r>
+            <w:proofErr w:type="gramEnd"/>
+            <w:r>
+              <w:t xml:space="preserve">-button </w:t>
             </w:r>
           </w:p>
         </w:tc>
@@ -5360,328 +5493,58 @@
 <file path=word/numbering.xml><?xml version="1.0" encoding="utf-8"?>
 <w:numbering xmlns:wpc="http://schemas.microsoft.com/office/word/2010/wordprocessingCanvas" xmlns:cx="http://schemas.microsoft.com/office/drawing/2014/chartex" xmlns:cx1="http://schemas.microsoft.com/office/drawing/2015/9/8/chartex" xmlns:cx2="http://schemas.microsoft.com/office/drawing/2015/10/21/chartex" xmlns:cx3="http://schemas.microsoft.com/office/drawing/2016/5/9/chartex" xmlns:cx4="http://schemas.microsoft.com/office/drawing/2016/5/10/chartex" xmlns:cx5="http://schemas.microsoft.com/office/drawing/2016/5/11/chartex" xmlns:cx6="http://schemas.microsoft.com/office/drawing/2016/5/12/chartex" xmlns:cx7="http://schemas.microsoft.com/office/drawing/2016/5/13/chartex" xmlns:cx8="http://schemas.microsoft.com/office/drawing/2016/5/14/chartex" xmlns:mc="http://schemas.openxmlformats.org/markup-compatibility/2006" xmlns:aink="http://schemas.microsoft.com/office/drawing/2016/ink" xmlns:am3d="http://schemas.microsoft.com/office/drawing/2017/model3d" xmlns:o="urn:schemas-microsoft-com:office:office" xmlns:oel="http://schemas.microsoft.com/office/2019/extlst" xmlns:r="http://schemas.openxmlformats.org/officeDocument/2006/relationships" xmlns:m="http://schemas.openxmlformats.org/officeDocument/2006/math" xmlns:v="urn:schemas-microsoft-com:vml" xmlns:wp14="http://schemas.microsoft.com/office/word/2010/wordprocessingDrawing" xmlns:wp="http://schemas.openxmlformats.org/drawingml/2006/wordprocessingDrawing" xmlns:w10="urn:schemas-microsoft-com:office:word" xmlns:w="http://schemas.openxmlformats.org/wordprocessingml/2006/main" xmlns:w14="http://schemas.microsoft.com/office/word/2010/wordml" xmlns:w15="http://schemas.microsoft.com/office/word/2012/wordml" xmlns:w16cex="http://schemas.microsoft.com/office/word/2018/wordml/cex" xmlns:w16cid="http://schemas.microsoft.com/office/word/2016/wordml/cid" xmlns:w16="http://schemas.microsoft.com/office/word/2018/wordml" xmlns:w16du="http://schemas.microsoft.com/office/word/2023/wordml/word16du" xmlns:w16sdtdh="http://schemas.microsoft.com/office/word/2020/wordml/sdtdatahash" xmlns:w16sdtfl="http://schemas.microsoft.com/office/word/2024/wordml/sdtformatlock" xmlns:w16se="http://schemas.microsoft.com/office/word/2015/wordml/symex" xmlns:wpg="http://schemas.microsoft.com/office/word/2010/wordprocessingGroup" xmlns:wpi="http://schemas.microsoft.com/office/word/2010/wordprocessingInk" xmlns:wne="http://schemas.microsoft.com/office/word/2006/wordml" xmlns:wps="http://schemas.microsoft.com/office/word/2010/wordprocessingShape" mc:Ignorable="w14 w15 w16se w16cid w16 w16cex w16sdtdh w16sdtfl w16du wp14">
   <w:numPicBullet w:numPicBulletId="0">
-    <mc:AlternateContent>
-      <mc:Choice Requires="v">
-        <w:pict>
-          <v:shapetype w14:anchorId="2A5C5E66" id="_x0000_t75" coordsize="21600,21600" o:spt="75" o:preferrelative="t" path="m@4@5l@4@11@9@11@9@5xe" filled="f" stroked="f">
-            <v:stroke joinstyle="miter"/>
-            <v:formulas>
-              <v:f eqn="if lineDrawn pixelLineWidth 0"/>
-              <v:f eqn="sum @0 1 0"/>
-              <v:f eqn="sum 0 0 @1"/>
-              <v:f eqn="prod @2 1 2"/>
-              <v:f eqn="prod @3 21600 pixelWidth"/>
-              <v:f eqn="prod @3 21600 pixelHeight"/>
-              <v:f eqn="sum @0 0 1"/>
-              <v:f eqn="prod @6 1 2"/>
-              <v:f eqn="prod @7 21600 pixelWidth"/>
-              <v:f eqn="sum @8 21600 0"/>
-              <v:f eqn="prod @7 21600 pixelHeight"/>
-              <v:f eqn="sum @10 21600 0"/>
-            </v:formulas>
-            <v:path o:extrusionok="f" gradientshapeok="t" o:connecttype="rect"/>
-            <o:lock v:ext="edit" aspectratio="t"/>
-          </v:shapetype>
-          <v:shape id="Grafik 1506227760" o:spid="_x0000_i1025" type="#_x0000_t75" style="width:14.4pt;height:14.4pt;visibility:visible;mso-wrap-style:square">
-            <v:imagedata r:id="rId1" o:title=""/>
-          </v:shape>
-        </w:pict>
-      </mc:Choice>
-      <mc:Fallback>
-        <w:drawing>
-          <wp:inline distT="0" distB="0" distL="0" distR="0" wp14:anchorId="25F9A466" wp14:editId="7524AE6D">
-            <wp:extent cx="182880" cy="182880"/>
-            <wp:effectExtent l="0" t="0" r="0" b="0"/>
-            <wp:docPr id="1506227760" name="Grafik 1506227760"/>
-            <wp:cNvGraphicFramePr>
-              <a:graphicFrameLocks xmlns:a="http://schemas.openxmlformats.org/drawingml/2006/main" noChangeAspect="1"/>
-            </wp:cNvGraphicFramePr>
-            <a:graphic xmlns:a="http://schemas.openxmlformats.org/drawingml/2006/main">
-              <a:graphicData uri="http://schemas.openxmlformats.org/drawingml/2006/picture">
-                <pic:pic xmlns:pic="http://schemas.openxmlformats.org/drawingml/2006/picture">
-                  <pic:nvPicPr>
-                    <pic:cNvPr id="0" name="Picture -1023"/>
-                    <pic:cNvPicPr>
-                      <a:picLocks noChangeAspect="1" noChangeArrowheads="1"/>
-                    </pic:cNvPicPr>
-                  </pic:nvPicPr>
-                  <pic:blipFill>
-                    <a:blip r:embed="rId2">
-                      <a:extLst>
-                        <a:ext uri="{28A0092B-C50C-407E-A947-70E740481C1C}">
-                          <a14:useLocalDpi xmlns:a14="http://schemas.microsoft.com/office/drawing/2010/main" val="0"/>
-                        </a:ext>
-                      </a:extLst>
-                    </a:blip>
-                    <a:srcRect/>
-                    <a:stretch>
-                      <a:fillRect/>
-                    </a:stretch>
-                  </pic:blipFill>
-                  <pic:spPr bwMode="auto">
-                    <a:xfrm>
-                      <a:off x="0" y="0"/>
-                      <a:ext cx="182880" cy="182880"/>
-                    </a:xfrm>
-                    <a:prstGeom prst="rect">
-                      <a:avLst/>
-                    </a:prstGeom>
-                    <a:noFill/>
-                    <a:ln>
-                      <a:noFill/>
-                    </a:ln>
-                  </pic:spPr>
-                </pic:pic>
-              </a:graphicData>
-            </a:graphic>
-          </wp:inline>
-        </w:drawing>
-      </mc:Fallback>
-    </mc:AlternateContent>
+    <w:pict>
+      <v:shapetype id="_x0000_t75" coordsize="21600,21600" o:spt="75" o:preferrelative="t" path="m@4@5l@4@11@9@11@9@5xe" filled="f" stroked="f">
+        <v:stroke joinstyle="miter"/>
+        <v:formulas>
+          <v:f eqn="if lineDrawn pixelLineWidth 0"/>
+          <v:f eqn="sum @0 1 0"/>
+          <v:f eqn="sum 0 0 @1"/>
+          <v:f eqn="prod @2 1 2"/>
+          <v:f eqn="prod @3 21600 pixelWidth"/>
+          <v:f eqn="prod @3 21600 pixelHeight"/>
+          <v:f eqn="sum @0 0 1"/>
+          <v:f eqn="prod @6 1 2"/>
+          <v:f eqn="prod @7 21600 pixelWidth"/>
+          <v:f eqn="sum @8 21600 0"/>
+          <v:f eqn="prod @7 21600 pixelHeight"/>
+          <v:f eqn="sum @10 21600 0"/>
+        </v:formulas>
+        <v:path o:extrusionok="f" gradientshapeok="t" o:connecttype="rect"/>
+        <o:lock v:ext="edit" aspectratio="t"/>
+      </v:shapetype>
+      <v:shape id="_x0000_i1056" type="#_x0000_t75" style="width:14.5pt;height:14.5pt;visibility:visible;mso-wrap-style:square" o:bullet="t">
+        <v:imagedata r:id="rId1" o:title=""/>
+      </v:shape>
+    </w:pict>
   </w:numPicBullet>
   <w:numPicBullet w:numPicBulletId="1">
-    <mc:AlternateContent>
-      <mc:Choice Requires="v">
-        <w:pict>
-          <v:shape w14:anchorId="03EA25B7" id="Grafik 335118753" o:spid="_x0000_i1025" type="#_x0000_t75" style="width:11.4pt;height:11.4pt;visibility:visible;mso-wrap-style:square">
-            <v:imagedata r:id="rId3" o:title=""/>
-          </v:shape>
-        </w:pict>
-      </mc:Choice>
-      <mc:Fallback>
-        <w:drawing>
-          <wp:inline distT="0" distB="0" distL="0" distR="0" wp14:anchorId="1B446F7B" wp14:editId="2B757A1B">
-            <wp:extent cx="144780" cy="144780"/>
-            <wp:effectExtent l="0" t="0" r="0" b="0"/>
-            <wp:docPr id="335118753" name="Grafik 335118753"/>
-            <wp:cNvGraphicFramePr>
-              <a:graphicFrameLocks xmlns:a="http://schemas.openxmlformats.org/drawingml/2006/main" noChangeAspect="1"/>
-            </wp:cNvGraphicFramePr>
-            <a:graphic xmlns:a="http://schemas.openxmlformats.org/drawingml/2006/main">
-              <a:graphicData uri="http://schemas.openxmlformats.org/drawingml/2006/picture">
-                <pic:pic xmlns:pic="http://schemas.openxmlformats.org/drawingml/2006/picture">
-                  <pic:nvPicPr>
-                    <pic:cNvPr id="0" name="Picture -1022"/>
-                    <pic:cNvPicPr>
-                      <a:picLocks noChangeAspect="1" noChangeArrowheads="1"/>
-                    </pic:cNvPicPr>
-                  </pic:nvPicPr>
-                  <pic:blipFill>
-                    <a:blip r:embed="rId4">
-                      <a:extLst>
-                        <a:ext uri="{28A0092B-C50C-407E-A947-70E740481C1C}">
-                          <a14:useLocalDpi xmlns:a14="http://schemas.microsoft.com/office/drawing/2010/main" val="0"/>
-                        </a:ext>
-                      </a:extLst>
-                    </a:blip>
-                    <a:srcRect/>
-                    <a:stretch>
-                      <a:fillRect/>
-                    </a:stretch>
-                  </pic:blipFill>
-                  <pic:spPr bwMode="auto">
-                    <a:xfrm>
-                      <a:off x="0" y="0"/>
-                      <a:ext cx="144780" cy="144780"/>
-                    </a:xfrm>
-                    <a:prstGeom prst="rect">
-                      <a:avLst/>
-                    </a:prstGeom>
-                    <a:noFill/>
-                    <a:ln>
-                      <a:noFill/>
-                    </a:ln>
-                  </pic:spPr>
-                </pic:pic>
-              </a:graphicData>
-            </a:graphic>
-          </wp:inline>
-        </w:drawing>
-      </mc:Fallback>
-    </mc:AlternateContent>
+    <w:pict>
+      <v:shape id="_x0000_i1057" type="#_x0000_t75" style="width:11.5pt;height:11.5pt;visibility:visible;mso-wrap-style:square" o:bullet="t">
+        <v:imagedata r:id="rId2" o:title=""/>
+      </v:shape>
+    </w:pict>
   </w:numPicBullet>
   <w:numPicBullet w:numPicBulletId="2">
-    <mc:AlternateContent>
-      <mc:Choice Requires="v">
-        <w:pict>
-          <v:shape w14:anchorId="172B8BA2" id="Grafik 1654788923" o:spid="_x0000_i1025" type="#_x0000_t75" alt="Beschreibung: 120px-Crystal_Clear_action_info" style="width:14.4pt;height:14.4pt;visibility:visible;mso-wrap-style:square">
-            <v:imagedata r:id="rId5" o:title=" 120px-Crystal_Clear_action_info"/>
-          </v:shape>
-        </w:pict>
-      </mc:Choice>
-      <mc:Fallback>
-        <w:drawing>
-          <wp:inline distT="0" distB="0" distL="0" distR="0" wp14:anchorId="54DA2F08" wp14:editId="514B1BD9">
-            <wp:extent cx="182880" cy="182880"/>
-            <wp:effectExtent l="0" t="0" r="0" b="0"/>
-            <wp:docPr id="1654788923" name="Grafik 1654788923" descr="Beschreibung: 120px-Crystal_Clear_action_info"/>
-            <wp:cNvGraphicFramePr>
-              <a:graphicFrameLocks xmlns:a="http://schemas.openxmlformats.org/drawingml/2006/main" noChangeAspect="1"/>
-            </wp:cNvGraphicFramePr>
-            <a:graphic xmlns:a="http://schemas.openxmlformats.org/drawingml/2006/main">
-              <a:graphicData uri="http://schemas.openxmlformats.org/drawingml/2006/picture">
-                <pic:pic xmlns:pic="http://schemas.openxmlformats.org/drawingml/2006/picture">
-                  <pic:nvPicPr>
-                    <pic:cNvPr id="0" name="Picture -1021" descr="Beschreibung: 120px-Crystal_Clear_action_info"/>
-                    <pic:cNvPicPr>
-                      <a:picLocks noChangeAspect="1" noChangeArrowheads="1"/>
-                    </pic:cNvPicPr>
-                  </pic:nvPicPr>
-                  <pic:blipFill>
-                    <a:blip r:embed="rId6">
-                      <a:extLst>
-                        <a:ext uri="{28A0092B-C50C-407E-A947-70E740481C1C}">
-                          <a14:useLocalDpi xmlns:a14="http://schemas.microsoft.com/office/drawing/2010/main" val="0"/>
-                        </a:ext>
-                      </a:extLst>
-                    </a:blip>
-                    <a:srcRect/>
-                    <a:stretch>
-                      <a:fillRect/>
-                    </a:stretch>
-                  </pic:blipFill>
-                  <pic:spPr bwMode="auto">
-                    <a:xfrm>
-                      <a:off x="0" y="0"/>
-                      <a:ext cx="182880" cy="182880"/>
-                    </a:xfrm>
-                    <a:prstGeom prst="rect">
-                      <a:avLst/>
-                    </a:prstGeom>
-                    <a:noFill/>
-                    <a:ln>
-                      <a:noFill/>
-                    </a:ln>
-                  </pic:spPr>
-                </pic:pic>
-              </a:graphicData>
-            </a:graphic>
-          </wp:inline>
-        </w:drawing>
-      </mc:Fallback>
-    </mc:AlternateContent>
+    <w:pict>
+      <v:shape id="_x0000_i1058" type="#_x0000_t75" alt="Beschreibung: 120px-Crystal_Clear_action_info" style="width:14.5pt;height:14.5pt;visibility:visible;mso-wrap-style:square" o:bullet="t">
+        <v:imagedata r:id="rId3" o:title=" 120px-Crystal_Clear_action_info"/>
+      </v:shape>
+    </w:pict>
   </w:numPicBullet>
   <w:numPicBullet w:numPicBulletId="3">
-    <mc:AlternateContent>
-      <mc:Choice Requires="v">
-        <w:pict>
-          <v:shape w14:anchorId="1D72E0F0" id="Grafik 1236923483" o:spid="_x0000_i1025" type="#_x0000_t75" alt="Beschreibung: 120px-Nuvola_apps_important" style="width:90pt;height:75pt;visibility:visible;mso-wrap-style:square">
-            <v:imagedata r:id="rId7" o:title=" 120px-Nuvola_apps_important"/>
-          </v:shape>
-        </w:pict>
-      </mc:Choice>
-      <mc:Fallback>
-        <w:drawing>
-          <wp:inline distT="0" distB="0" distL="0" distR="0" wp14:anchorId="49783AC9" wp14:editId="2473FA87">
-            <wp:extent cx="1143000" cy="952500"/>
-            <wp:effectExtent l="0" t="0" r="0" b="0"/>
-            <wp:docPr id="1236923483" name="Grafik 1236923483" descr="Beschreibung: 120px-Nuvola_apps_important"/>
-            <wp:cNvGraphicFramePr>
-              <a:graphicFrameLocks xmlns:a="http://schemas.openxmlformats.org/drawingml/2006/main" noChangeAspect="1"/>
-            </wp:cNvGraphicFramePr>
-            <a:graphic xmlns:a="http://schemas.openxmlformats.org/drawingml/2006/main">
-              <a:graphicData uri="http://schemas.openxmlformats.org/drawingml/2006/picture">
-                <pic:pic xmlns:pic="http://schemas.openxmlformats.org/drawingml/2006/picture">
-                  <pic:nvPicPr>
-                    <pic:cNvPr id="0" name="Picture -1020" descr="Beschreibung: 120px-Nuvola_apps_important"/>
-                    <pic:cNvPicPr>
-                      <a:picLocks noChangeAspect="1" noChangeArrowheads="1"/>
-                    </pic:cNvPicPr>
-                  </pic:nvPicPr>
-                  <pic:blipFill>
-                    <a:blip r:embed="rId8">
-                      <a:extLst>
-                        <a:ext uri="{28A0092B-C50C-407E-A947-70E740481C1C}">
-                          <a14:useLocalDpi xmlns:a14="http://schemas.microsoft.com/office/drawing/2010/main" val="0"/>
-                        </a:ext>
-                      </a:extLst>
-                    </a:blip>
-                    <a:srcRect/>
-                    <a:stretch>
-                      <a:fillRect/>
-                    </a:stretch>
-                  </pic:blipFill>
-                  <pic:spPr bwMode="auto">
-                    <a:xfrm>
-                      <a:off x="0" y="0"/>
-                      <a:ext cx="1143000" cy="952500"/>
-                    </a:xfrm>
-                    <a:prstGeom prst="rect">
-                      <a:avLst/>
-                    </a:prstGeom>
-                    <a:noFill/>
-                    <a:ln>
-                      <a:noFill/>
-                    </a:ln>
-                  </pic:spPr>
-                </pic:pic>
-              </a:graphicData>
-            </a:graphic>
-          </wp:inline>
-        </w:drawing>
-      </mc:Fallback>
-    </mc:AlternateContent>
+    <w:pict>
+      <v:shape id="_x0000_i1059" type="#_x0000_t75" alt="Beschreibung: 120px-Nuvola_apps_important" style="width:90pt;height:75pt;visibility:visible;mso-wrap-style:square" o:bullet="t">
+        <v:imagedata r:id="rId4" o:title=" 120px-Nuvola_apps_important"/>
+      </v:shape>
+    </w:pict>
   </w:numPicBullet>
   <w:numPicBullet w:numPicBulletId="4">
-    <mc:AlternateContent>
-      <mc:Choice Requires="v">
-        <w:pict>
-          <v:shape w14:anchorId="53605157" id="Grafik 645831701" o:spid="_x0000_i1025" type="#_x0000_t75" alt="Beschreibung: 120px-Crystal_Clear_app_ktip" style="width:14.4pt;height:14.4pt;visibility:visible;mso-wrap-style:square">
-            <v:imagedata r:id="rId9" o:title=" 120px-Crystal_Clear_app_ktip"/>
-          </v:shape>
-        </w:pict>
-      </mc:Choice>
-      <mc:Fallback>
-        <w:drawing>
-          <wp:inline distT="0" distB="0" distL="0" distR="0" wp14:anchorId="105EC7CA" wp14:editId="1F235372">
-            <wp:extent cx="182880" cy="182880"/>
-            <wp:effectExtent l="0" t="0" r="0" b="0"/>
-            <wp:docPr id="645831701" name="Grafik 645831701" descr="Beschreibung: 120px-Crystal_Clear_app_ktip"/>
-            <wp:cNvGraphicFramePr>
-              <a:graphicFrameLocks xmlns:a="http://schemas.openxmlformats.org/drawingml/2006/main" noChangeAspect="1"/>
-            </wp:cNvGraphicFramePr>
-            <a:graphic xmlns:a="http://schemas.openxmlformats.org/drawingml/2006/main">
-              <a:graphicData uri="http://schemas.openxmlformats.org/drawingml/2006/picture">
-                <pic:pic xmlns:pic="http://schemas.openxmlformats.org/drawingml/2006/picture">
-                  <pic:nvPicPr>
-                    <pic:cNvPr id="0" name="Picture -1019" descr="Beschreibung: 120px-Crystal_Clear_app_ktip"/>
-                    <pic:cNvPicPr>
-                      <a:picLocks noChangeAspect="1" noChangeArrowheads="1"/>
-                    </pic:cNvPicPr>
-                  </pic:nvPicPr>
-                  <pic:blipFill>
-                    <a:blip r:embed="rId10">
-                      <a:extLst>
-                        <a:ext uri="{28A0092B-C50C-407E-A947-70E740481C1C}">
-                          <a14:useLocalDpi xmlns:a14="http://schemas.microsoft.com/office/drawing/2010/main" val="0"/>
-                        </a:ext>
-                      </a:extLst>
-                    </a:blip>
-                    <a:srcRect/>
-                    <a:stretch>
-                      <a:fillRect/>
-                    </a:stretch>
-                  </pic:blipFill>
-                  <pic:spPr bwMode="auto">
-                    <a:xfrm>
-                      <a:off x="0" y="0"/>
-                      <a:ext cx="182880" cy="182880"/>
-                    </a:xfrm>
-                    <a:prstGeom prst="rect">
-                      <a:avLst/>
-                    </a:prstGeom>
-                    <a:noFill/>
-                    <a:ln>
-                      <a:noFill/>
-                    </a:ln>
-                  </pic:spPr>
-                </pic:pic>
-              </a:graphicData>
-            </a:graphic>
-          </wp:inline>
-        </w:drawing>
-      </mc:Fallback>
-    </mc:AlternateContent>
+    <w:pict>
+      <v:shape id="_x0000_i1060" type="#_x0000_t75" alt="Beschreibung: 120px-Crystal_Clear_app_ktip" style="width:14.5pt;height:14.5pt;visibility:visible;mso-wrap-style:square" o:bullet="t">
+        <v:imagedata r:id="rId5" o:title=" 120px-Crystal_Clear_app_ktip"/>
+      </v:shape>
+    </w:pict>
   </w:numPicBullet>
   <w:abstractNum w:abstractNumId="0" w15:restartNumberingAfterBreak="0">
     <w:nsid w:val="FFFFFF7C"/>
@@ -8292,6 +8155,16 @@
       </w:tcPr>
     </w:tblStylePr>
   </w:style>
+  <w:style w:type="character" w:styleId="Hervorhebung">
+    <w:name w:val="Emphasis"/>
+    <w:basedOn w:val="Absatz-Standardschriftart"/>
+    <w:qFormat/>
+    <w:rsid w:val="00F74455"/>
+    <w:rPr>
+      <w:i/>
+      <w:iCs/>
+    </w:rPr>
+  </w:style>
 </w:styles>
 </file>
 

</xml_diff>

<commit_message>
perchance + usae-monitoring + funke-feed-comarrison
</commit_message>
<xml_diff>
--- a/doc/doku.docx
+++ b/doc/doku.docx
@@ -15,6 +15,106 @@
         <w:pStyle w:val="berschrift1"/>
       </w:pPr>
       <w:r>
+        <w:t>Allgemeine Shortcuts</w:t>
+      </w:r>
+    </w:p>
+    <w:tbl>
+      <w:tblPr>
+        <w:tblStyle w:val="Tabellenraster"/>
+        <w:tblW w:w="0" w:type="auto"/>
+        <w:tblLook w:val="04A0" w:firstRow="1" w:lastRow="0" w:firstColumn="1" w:lastColumn="0" w:noHBand="0" w:noVBand="1"/>
+      </w:tblPr>
+      <w:tblGrid>
+        <w:gridCol w:w="987"/>
+        <w:gridCol w:w="6600"/>
+      </w:tblGrid>
+      <w:tr>
+        <w:tc>
+          <w:tcPr>
+            <w:tcW w:w="987" w:type="dxa"/>
+          </w:tcPr>
+          <w:p>
+            <w:r>
+              <w:t>Alt+L</w:t>
+            </w:r>
+          </w:p>
+        </w:tc>
+        <w:tc>
+          <w:tcPr>
+            <w:tcW w:w="6600" w:type="dxa"/>
+          </w:tcPr>
+          <w:p>
+            <w:r>
+              <w:t>Sprache auswählen</w:t>
+            </w:r>
+          </w:p>
+        </w:tc>
+      </w:tr>
+      <w:tr>
+        <w:tc>
+          <w:tcPr>
+            <w:tcW w:w="987" w:type="dxa"/>
+          </w:tcPr>
+          <w:p>
+            <w:r>
+              <w:t>F8</w:t>
+            </w:r>
+          </w:p>
+        </w:tc>
+        <w:tc>
+          <w:tcPr>
+            <w:tcW w:w="6600" w:type="dxa"/>
+          </w:tcPr>
+          <w:p/>
+        </w:tc>
+      </w:tr>
+      <w:tr>
+        <w:tc>
+          <w:tcPr>
+            <w:tcW w:w="987" w:type="dxa"/>
+          </w:tcPr>
+          <w:p>
+            <w:r>
+              <w:t>Shift+F8</w:t>
+            </w:r>
+          </w:p>
+        </w:tc>
+        <w:tc>
+          <w:tcPr>
+            <w:tcW w:w="6600" w:type="dxa"/>
+          </w:tcPr>
+          <w:p/>
+        </w:tc>
+      </w:tr>
+      <w:tr>
+        <w:tc>
+          <w:tcPr>
+            <w:tcW w:w="987" w:type="dxa"/>
+          </w:tcPr>
+          <w:p>
+            <w:r>
+              <w:t>Alt+Klick</w:t>
+            </w:r>
+          </w:p>
+        </w:tc>
+        <w:tc>
+          <w:tcPr>
+            <w:tcW w:w="6600" w:type="dxa"/>
+          </w:tcPr>
+          <w:p>
+            <w:r>
+              <w:t>Artikel markieren</w:t>
+            </w:r>
+          </w:p>
+        </w:tc>
+      </w:tr>
+    </w:tbl>
+    <w:p/>
+    <w:p>
+      <w:pPr>
+        <w:pStyle w:val="berschrift1"/>
+      </w:pPr>
+      <w:r>
         <w:t>Datei- und Verzeichnisstruktur</w:t>
       </w:r>
     </w:p>
@@ -734,7 +834,6 @@
         <w:pStyle w:val="berschrift3"/>
       </w:pPr>
       <w:r>
-        <w:lastRenderedPageBreak/>
         <w:t>Optionen</w:t>
       </w:r>
     </w:p>
@@ -2725,45 +2824,1003 @@
       </w:tr>
     </w:tbl>
     <w:p/>
+    <w:p>
+      <w:pPr>
+        <w:pStyle w:val="berschrift1"/>
+      </w:pPr>
+      <w:r>
+        <w:t>Shortcut Key Handler</w:t>
+      </w:r>
+    </w:p>
+    <w:p>
+      <w:pPr>
+        <w:pStyle w:val="berschrift2"/>
+        <w:rPr>
+          <w:lang w:val="en-US"/>
+        </w:rPr>
+      </w:pPr>
+      <w:r>
+        <w:rPr>
+          <w:lang w:val="en-US"/>
+        </w:rPr>
+        <w:t>Re</w:t>
+      </w:r>
+      <w:r>
+        <w:rPr>
+          <w:lang w:val="en-US"/>
+        </w:rPr>
+        <w:t>gistrierung</w:t>
+      </w:r>
+    </w:p>
+    <w:p>
+      <w:pPr>
+        <w:pStyle w:val="Quelltexteingerckt"/>
+        <w:rPr>
+          <w:lang w:val="en-US"/>
+        </w:rPr>
+      </w:pPr>
+      <w:r>
+        <w:rPr>
+          <w:lang w:val="en-US"/>
+        </w:rPr>
+        <w:t>w</w:t>
+      </w:r>
+      <w:r>
+        <w:rPr>
+          <w:lang w:val="en-US"/>
+        </w:rPr>
+        <w:t>indow.</w:t>
+      </w:r>
+      <w:r>
+        <w:rPr>
+          <w:lang w:val="en-US"/>
+        </w:rPr>
+        <w:t>addKeyHandler</w:t>
+      </w:r>
+      <w:r>
+        <w:rPr>
+          <w:lang w:val="en-US"/>
+        </w:rPr>
+        <w:t>(</w:t>
+      </w:r>
+      <w:r>
+        <w:rPr>
+          <w:lang w:val="en-US"/>
+        </w:rPr>
+        <w:t>key</w:t>
+      </w:r>
+      <w:r>
+        <w:rPr>
+          <w:lang w:val="en-US"/>
+        </w:rPr>
+        <w:t xml:space="preserve">, </w:t>
+      </w:r>
+      <w:r>
+        <w:rPr>
+          <w:lang w:val="en-US"/>
+        </w:rPr>
+        <w:t>handler</w:t>
+      </w:r>
+      <w:r>
+        <w:rPr>
+          <w:lang w:val="en-US"/>
+        </w:rPr>
+        <w:t>, options</w:t>
+      </w:r>
+      <w:r>
+        <w:rPr>
+          <w:lang w:val="en-US"/>
+        </w:rPr>
+        <w:t>);</w:t>
+      </w:r>
+    </w:p>
+    <w:p>
+      <w:pPr>
+        <w:pStyle w:val="Quelltexteingerckt"/>
+        <w:rPr>
+          <w:lang w:val="en-US"/>
+        </w:rPr>
+      </w:pPr>
+      <w:r>
+        <w:rPr>
+          <w:lang w:val="en-US"/>
+        </w:rPr>
+        <w:t>w</w:t>
+      </w:r>
+      <w:r>
+        <w:rPr>
+          <w:lang w:val="en-US"/>
+        </w:rPr>
+        <w:t>indow.</w:t>
+      </w:r>
+      <w:r>
+        <w:rPr>
+          <w:lang w:val="en-US"/>
+        </w:rPr>
+        <w:t>addKeyHandler</w:t>
+      </w:r>
+      <w:r>
+        <w:rPr>
+          <w:lang w:val="en-US"/>
+        </w:rPr>
+        <w:t>(</w:t>
+      </w:r>
+      <w:r>
+        <w:rPr>
+          <w:lang w:val="en-US"/>
+        </w:rPr>
+        <w:t>key1</w:t>
+      </w:r>
+      <w:r>
+        <w:rPr>
+          <w:lang w:val="en-US"/>
+        </w:rPr>
+        <w:t xml:space="preserve">, </w:t>
+      </w:r>
+      <w:r>
+        <w:rPr>
+          <w:lang w:val="en-US"/>
+        </w:rPr>
+        <w:t>key2</w:t>
+      </w:r>
+      <w:r>
+        <w:rPr>
+          <w:lang w:val="en-US"/>
+        </w:rPr>
+        <w:t>, handler</w:t>
+      </w:r>
+      <w:r>
+        <w:rPr>
+          <w:lang w:val="en-US"/>
+        </w:rPr>
+        <w:t>, options</w:t>
+      </w:r>
+      <w:r>
+        <w:rPr>
+          <w:lang w:val="en-US"/>
+        </w:rPr>
+        <w:t>)</w:t>
+      </w:r>
+      <w:r>
+        <w:rPr>
+          <w:lang w:val="en-US"/>
+        </w:rPr>
+        <w:t>;</w:t>
+      </w:r>
+    </w:p>
+    <w:p>
+      <w:pPr>
+        <w:pStyle w:val="Quelltexteingerckt"/>
+        <w:rPr>
+          <w:lang w:val="en-US"/>
+        </w:rPr>
+      </w:pPr>
+      <w:r>
+        <w:rPr>
+          <w:lang w:val="en-US"/>
+        </w:rPr>
+        <w:t>w</w:t>
+      </w:r>
+      <w:r>
+        <w:rPr>
+          <w:lang w:val="en-US"/>
+        </w:rPr>
+        <w:t>indow.</w:t>
+      </w:r>
+      <w:r>
+        <w:rPr>
+          <w:lang w:val="en-US"/>
+        </w:rPr>
+        <w:t>contextAdd</w:t>
+      </w:r>
+      <w:r>
+        <w:rPr>
+          <w:lang w:val="en-US"/>
+        </w:rPr>
+        <w:t>(</w:t>
+      </w:r>
+      <w:r>
+        <w:rPr>
+          <w:lang w:val="en-US"/>
+        </w:rPr>
+        <w:t xml:space="preserve">context, </w:t>
+      </w:r>
+      <w:r>
+        <w:rPr>
+          <w:lang w:val="en-US"/>
+        </w:rPr>
+        <w:t>key</w:t>
+      </w:r>
+      <w:r>
+        <w:rPr>
+          <w:lang w:val="en-US"/>
+        </w:rPr>
+        <w:t xml:space="preserve">, </w:t>
+      </w:r>
+      <w:r>
+        <w:rPr>
+          <w:lang w:val="en-US"/>
+        </w:rPr>
+        <w:t>handler, options);</w:t>
+      </w:r>
+    </w:p>
+    <w:p>
+      <w:pPr>
+        <w:pStyle w:val="Quelltexteingerckt"/>
+        <w:rPr>
+          <w:lang w:val="en-US"/>
+        </w:rPr>
+      </w:pPr>
+      <w:r>
+        <w:rPr>
+          <w:lang w:val="en-US"/>
+        </w:rPr>
+        <w:t>w</w:t>
+      </w:r>
+      <w:r>
+        <w:rPr>
+          <w:lang w:val="en-US"/>
+        </w:rPr>
+        <w:t>indow.</w:t>
+      </w:r>
+      <w:r>
+        <w:rPr>
+          <w:lang w:val="en-US"/>
+        </w:rPr>
+        <w:t>contextAdd</w:t>
+      </w:r>
+      <w:r>
+        <w:rPr>
+          <w:lang w:val="en-US"/>
+        </w:rPr>
+        <w:t>(</w:t>
+      </w:r>
+      <w:r>
+        <w:rPr>
+          <w:lang w:val="en-US"/>
+        </w:rPr>
+        <w:t xml:space="preserve">context, </w:t>
+      </w:r>
+      <w:r>
+        <w:rPr>
+          <w:lang w:val="en-US"/>
+        </w:rPr>
+        <w:t>key1, key2, handler, options)</w:t>
+      </w:r>
+      <w:r>
+        <w:rPr>
+          <w:lang w:val="en-US"/>
+        </w:rPr>
+        <w:t>;</w:t>
+      </w:r>
+    </w:p>
+    <w:p>
+      <w:pPr>
+        <w:pStyle w:val="berschrift3"/>
+      </w:pPr>
+      <w:r>
+        <w:t>Parameters</w:t>
+      </w:r>
+    </w:p>
+    <w:tbl>
+      <w:tblPr>
+        <w:tblStyle w:val="Listentabelle4Akzent1"/>
+        <w:tblW w:w="0" w:type="auto"/>
+        <w:tblLook w:val="04A0" w:firstRow="1" w:lastRow="0" w:firstColumn="1" w:lastColumn="0" w:noHBand="0" w:noVBand="1"/>
+      </w:tblPr>
+      <w:tblGrid>
+        <w:gridCol w:w="397"/>
+        <w:gridCol w:w="1951"/>
+        <w:gridCol w:w="1289"/>
+        <w:gridCol w:w="1405"/>
+        <w:gridCol w:w="2033"/>
+      </w:tblGrid>
+      <w:tr>
+        <w:trPr>
+          <w:cnfStyle w:val="100000000000" w:firstRow="1" w:lastRow="0" w:firstColumn="0" w:lastColumn="0" w:oddVBand="0" w:evenVBand="0" w:oddHBand="0" w:evenHBand="0" w:firstRowFirstColumn="0" w:firstRowLastColumn="0" w:lastRowFirstColumn="0" w:lastRowLastColumn="0"/>
+        </w:trPr>
+        <w:tc>
+          <w:tcPr>
+            <w:cnfStyle w:val="001000000000" w:firstRow="0" w:lastRow="0" w:firstColumn="1" w:lastColumn="0" w:oddVBand="0" w:evenVBand="0" w:oddHBand="0" w:evenHBand="0" w:firstRowFirstColumn="0" w:firstRowLastColumn="0" w:lastRowFirstColumn="0" w:lastRowLastColumn="0"/>
+            <w:tcW w:w="2346" w:type="dxa"/>
+            <w:gridSpan w:val="2"/>
+          </w:tcPr>
+          <w:p>
+            <w:r>
+              <w:t>Name</w:t>
+            </w:r>
+          </w:p>
+        </w:tc>
+        <w:tc>
+          <w:tcPr>
+            <w:tcW w:w="1289" w:type="dxa"/>
+          </w:tcPr>
+          <w:p>
+            <w:pPr>
+              <w:cnfStyle w:val="100000000000" w:firstRow="1" w:lastRow="0" w:firstColumn="0" w:lastColumn="0" w:oddVBand="0" w:evenVBand="0" w:oddHBand="0" w:evenHBand="0" w:firstRowFirstColumn="0" w:firstRowLastColumn="0" w:lastRowFirstColumn="0" w:lastRowLastColumn="0"/>
+            </w:pPr>
+            <w:r>
+              <w:t>Typ</w:t>
+            </w:r>
+          </w:p>
+        </w:tc>
+        <w:tc>
+          <w:tcPr>
+            <w:tcW w:w="1405" w:type="dxa"/>
+          </w:tcPr>
+          <w:p>
+            <w:pPr>
+              <w:cnfStyle w:val="100000000000" w:firstRow="1" w:lastRow="0" w:firstColumn="0" w:lastColumn="0" w:oddVBand="0" w:evenVBand="0" w:oddHBand="0" w:evenHBand="0" w:firstRowFirstColumn="0" w:firstRowLastColumn="0" w:lastRowFirstColumn="0" w:lastRowLastColumn="0"/>
+            </w:pPr>
+            <w:r>
+              <w:t>Defaultwert</w:t>
+            </w:r>
+          </w:p>
+        </w:tc>
+        <w:tc>
+          <w:tcPr>
+            <w:tcW w:w="2033" w:type="dxa"/>
+          </w:tcPr>
+          <w:p>
+            <w:pPr>
+              <w:cnfStyle w:val="100000000000" w:firstRow="1" w:lastRow="0" w:firstColumn="0" w:lastColumn="0" w:oddVBand="0" w:evenVBand="0" w:oddHBand="0" w:evenHBand="0" w:firstRowFirstColumn="0" w:firstRowLastColumn="0" w:lastRowFirstColumn="0" w:lastRowLastColumn="0"/>
+            </w:pPr>
+            <w:r>
+              <w:t>Beschreibung</w:t>
+            </w:r>
+          </w:p>
+        </w:tc>
+      </w:tr>
+      <w:tr>
+        <w:trPr>
+          <w:cnfStyle w:val="000000100000" w:firstRow="0" w:lastRow="0" w:firstColumn="0" w:lastColumn="0" w:oddVBand="0" w:evenVBand="0" w:oddHBand="1" w:evenHBand="0" w:firstRowFirstColumn="0" w:firstRowLastColumn="0" w:lastRowFirstColumn="0" w:lastRowLastColumn="0"/>
+        </w:trPr>
+        <w:tc>
+          <w:tcPr>
+            <w:cnfStyle w:val="001000000000" w:firstRow="0" w:lastRow="0" w:firstColumn="1" w:lastColumn="0" w:oddVBand="0" w:evenVBand="0" w:oddHBand="0" w:evenHBand="0" w:firstRowFirstColumn="0" w:firstRowLastColumn="0" w:lastRowFirstColumn="0" w:lastRowLastColumn="0"/>
+            <w:tcW w:w="2346" w:type="dxa"/>
+            <w:gridSpan w:val="2"/>
+          </w:tcPr>
+          <w:p>
+            <w:pPr>
+              <w:rPr>
+                <w:rStyle w:val="QuelltextZeichen"/>
+              </w:rPr>
+            </w:pPr>
+            <w:r>
+              <w:rPr>
+                <w:rStyle w:val="QuelltextZeichen"/>
+              </w:rPr>
+              <w:t>k</w:t>
+            </w:r>
+            <w:r>
+              <w:rPr>
+                <w:rStyle w:val="QuelltextZeichen"/>
+              </w:rPr>
+              <w:t>ey</w:t>
+            </w:r>
+          </w:p>
+        </w:tc>
+        <w:tc>
+          <w:tcPr>
+            <w:tcW w:w="1289" w:type="dxa"/>
+          </w:tcPr>
+          <w:p>
+            <w:pPr>
+              <w:cnfStyle w:val="000000100000" w:firstRow="0" w:lastRow="0" w:firstColumn="0" w:lastColumn="0" w:oddVBand="0" w:evenVBand="0" w:oddHBand="1" w:evenHBand="0" w:firstRowFirstColumn="0" w:firstRowLastColumn="0" w:lastRowFirstColumn="0" w:lastRowLastColumn="0"/>
+            </w:pPr>
+            <w:r>
+              <w:t>s</w:t>
+            </w:r>
+            <w:r>
+              <w:t>tring</w:t>
+            </w:r>
+          </w:p>
+        </w:tc>
+        <w:tc>
+          <w:tcPr>
+            <w:tcW w:w="1405" w:type="dxa"/>
+          </w:tcPr>
+          <w:p>
+            <w:pPr>
+              <w:cnfStyle w:val="000000100000" w:firstRow="0" w:lastRow="0" w:firstColumn="0" w:lastColumn="0" w:oddVBand="0" w:evenVBand="0" w:oddHBand="1" w:evenHBand="0" w:firstRowFirstColumn="0" w:firstRowLastColumn="0" w:lastRowFirstColumn="0" w:lastRowLastColumn="0"/>
+            </w:pPr>
+          </w:p>
+        </w:tc>
+        <w:tc>
+          <w:tcPr>
+            <w:tcW w:w="2033" w:type="dxa"/>
+          </w:tcPr>
+          <w:p>
+            <w:pPr>
+              <w:cnfStyle w:val="000000100000" w:firstRow="0" w:lastRow="0" w:firstColumn="0" w:lastColumn="0" w:oddVBand="0" w:evenVBand="0" w:oddHBand="1" w:evenHBand="0" w:firstRowFirstColumn="0" w:firstRowLastColumn="0" w:lastRowFirstColumn="0" w:lastRowLastColumn="0"/>
+              <w:rPr>
+                <w:lang w:val="en-US"/>
+              </w:rPr>
+            </w:pPr>
+            <w:r>
+              <w:rPr>
+                <w:lang w:val="en-US"/>
+              </w:rPr>
+              <w:t xml:space="preserve">A key-code  or a combination (e.g. </w:t>
+            </w:r>
+            <w:r>
+              <w:rPr>
+                <w:lang w:val="en-US"/>
+              </w:rPr>
+              <w:t>Shift+KeyA)</w:t>
+            </w:r>
+          </w:p>
+        </w:tc>
+      </w:tr>
+      <w:tr>
+        <w:tc>
+          <w:tcPr>
+            <w:cnfStyle w:val="001000000000" w:firstRow="0" w:lastRow="0" w:firstColumn="1" w:lastColumn="0" w:oddVBand="0" w:evenVBand="0" w:oddHBand="0" w:evenHBand="0" w:firstRowFirstColumn="0" w:firstRowLastColumn="0" w:lastRowFirstColumn="0" w:lastRowLastColumn="0"/>
+            <w:tcW w:w="2346" w:type="dxa"/>
+            <w:gridSpan w:val="2"/>
+          </w:tcPr>
+          <w:p>
+            <w:pPr>
+              <w:rPr>
+                <w:rStyle w:val="QuelltextZeichen"/>
+              </w:rPr>
+            </w:pPr>
+            <w:r>
+              <w:rPr>
+                <w:rStyle w:val="QuelltextZeichen"/>
+              </w:rPr>
+              <w:t>k</w:t>
+            </w:r>
+            <w:r>
+              <w:rPr>
+                <w:rStyle w:val="QuelltextZeichen"/>
+              </w:rPr>
+              <w:t>ey1</w:t>
+            </w:r>
+          </w:p>
+        </w:tc>
+        <w:tc>
+          <w:tcPr>
+            <w:tcW w:w="1289" w:type="dxa"/>
+          </w:tcPr>
+          <w:p>
+            <w:pPr>
+              <w:cnfStyle w:val="000000000000" w:firstRow="0" w:lastRow="0" w:firstColumn="0" w:lastColumn="0" w:oddVBand="0" w:evenVBand="0" w:oddHBand="0" w:evenHBand="0" w:firstRowFirstColumn="0" w:firstRowLastColumn="0" w:lastRowFirstColumn="0" w:lastRowLastColumn="0"/>
+            </w:pPr>
+            <w:r>
+              <w:t>string</w:t>
+            </w:r>
+          </w:p>
+        </w:tc>
+        <w:tc>
+          <w:tcPr>
+            <w:tcW w:w="1405" w:type="dxa"/>
+          </w:tcPr>
+          <w:p>
+            <w:pPr>
+              <w:cnfStyle w:val="000000000000" w:firstRow="0" w:lastRow="0" w:firstColumn="0" w:lastColumn="0" w:oddVBand="0" w:evenVBand="0" w:oddHBand="0" w:evenHBand="0" w:firstRowFirstColumn="0" w:firstRowLastColumn="0" w:lastRowFirstColumn="0" w:lastRowLastColumn="0"/>
+            </w:pPr>
+          </w:p>
+        </w:tc>
+        <w:tc>
+          <w:tcPr>
+            <w:tcW w:w="2033" w:type="dxa"/>
+          </w:tcPr>
+          <w:p>
+            <w:pPr>
+              <w:cnfStyle w:val="000000000000" w:firstRow="0" w:lastRow="0" w:firstColumn="0" w:lastColumn="0" w:oddVBand="0" w:evenVBand="0" w:oddHBand="0" w:evenHBand="0" w:firstRowFirstColumn="0" w:firstRowLastColumn="0" w:lastRowFirstColumn="0" w:lastRowLastColumn="0"/>
+              <w:rPr>
+                <w:lang w:val="en-US"/>
+              </w:rPr>
+            </w:pPr>
+            <w:r>
+              <w:rPr>
+                <w:lang w:val="en-US"/>
+              </w:rPr>
+              <w:t>The first key of a</w:t>
+            </w:r>
+            <w:r>
+              <w:rPr>
+                <w:lang w:val="en-US"/>
+              </w:rPr>
+              <w:t xml:space="preserve"> multi-key shortcut</w:t>
+            </w:r>
+          </w:p>
+        </w:tc>
+      </w:tr>
+      <w:tr>
+        <w:trPr>
+          <w:cnfStyle w:val="000000100000" w:firstRow="0" w:lastRow="0" w:firstColumn="0" w:lastColumn="0" w:oddVBand="0" w:evenVBand="0" w:oddHBand="1" w:evenHBand="0" w:firstRowFirstColumn="0" w:firstRowLastColumn="0" w:lastRowFirstColumn="0" w:lastRowLastColumn="0"/>
+        </w:trPr>
+        <w:tc>
+          <w:tcPr>
+            <w:cnfStyle w:val="001000000000" w:firstRow="0" w:lastRow="0" w:firstColumn="1" w:lastColumn="0" w:oddVBand="0" w:evenVBand="0" w:oddHBand="0" w:evenHBand="0" w:firstRowFirstColumn="0" w:firstRowLastColumn="0" w:lastRowFirstColumn="0" w:lastRowLastColumn="0"/>
+            <w:tcW w:w="2346" w:type="dxa"/>
+            <w:gridSpan w:val="2"/>
+          </w:tcPr>
+          <w:p>
+            <w:r>
+              <w:rPr>
+                <w:rStyle w:val="QuelltextZeichen"/>
+              </w:rPr>
+              <w:t>k</w:t>
+            </w:r>
+            <w:r>
+              <w:rPr>
+                <w:rStyle w:val="QuelltextZeichen"/>
+              </w:rPr>
+              <w:t>ey2</w:t>
+            </w:r>
+          </w:p>
+        </w:tc>
+        <w:tc>
+          <w:tcPr>
+            <w:tcW w:w="1289" w:type="dxa"/>
+          </w:tcPr>
+          <w:p>
+            <w:pPr>
+              <w:cnfStyle w:val="000000100000" w:firstRow="0" w:lastRow="0" w:firstColumn="0" w:lastColumn="0" w:oddVBand="0" w:evenVBand="0" w:oddHBand="1" w:evenHBand="0" w:firstRowFirstColumn="0" w:firstRowLastColumn="0" w:lastRowFirstColumn="0" w:lastRowLastColumn="0"/>
+            </w:pPr>
+            <w:r>
+              <w:t>string</w:t>
+            </w:r>
+          </w:p>
+        </w:tc>
+        <w:tc>
+          <w:tcPr>
+            <w:tcW w:w="1405" w:type="dxa"/>
+          </w:tcPr>
+          <w:p>
+            <w:pPr>
+              <w:cnfStyle w:val="000000100000" w:firstRow="0" w:lastRow="0" w:firstColumn="0" w:lastColumn="0" w:oddVBand="0" w:evenVBand="0" w:oddHBand="1" w:evenHBand="0" w:firstRowFirstColumn="0" w:firstRowLastColumn="0" w:lastRowFirstColumn="0" w:lastRowLastColumn="0"/>
+            </w:pPr>
+          </w:p>
+        </w:tc>
+        <w:tc>
+          <w:tcPr>
+            <w:tcW w:w="2033" w:type="dxa"/>
+          </w:tcPr>
+          <w:p>
+            <w:pPr>
+              <w:cnfStyle w:val="000000100000" w:firstRow="0" w:lastRow="0" w:firstColumn="0" w:lastColumn="0" w:oddVBand="0" w:evenVBand="0" w:oddHBand="1" w:evenHBand="0" w:firstRowFirstColumn="0" w:firstRowLastColumn="0" w:lastRowFirstColumn="0" w:lastRowLastColumn="0"/>
+              <w:rPr>
+                <w:lang w:val="en-US"/>
+              </w:rPr>
+            </w:pPr>
+            <w:r>
+              <w:rPr>
+                <w:lang w:val="en-US"/>
+              </w:rPr>
+              <w:t>The second key of a</w:t>
+            </w:r>
+            <w:r>
+              <w:rPr>
+                <w:lang w:val="en-US"/>
+              </w:rPr>
+              <w:t xml:space="preserve"> multi-key shortcut</w:t>
+            </w:r>
+          </w:p>
+        </w:tc>
+      </w:tr>
+      <w:tr>
+        <w:tc>
+          <w:tcPr>
+            <w:cnfStyle w:val="001000000000" w:firstRow="0" w:lastRow="0" w:firstColumn="1" w:lastColumn="0" w:oddVBand="0" w:evenVBand="0" w:oddHBand="0" w:evenHBand="0" w:firstRowFirstColumn="0" w:firstRowLastColumn="0" w:lastRowFirstColumn="0" w:lastRowLastColumn="0"/>
+            <w:tcW w:w="2346" w:type="dxa"/>
+            <w:gridSpan w:val="2"/>
+          </w:tcPr>
+          <w:p>
+            <w:r>
+              <w:rPr>
+                <w:rStyle w:val="QuelltextZeichen"/>
+              </w:rPr>
+              <w:t>h</w:t>
+            </w:r>
+            <w:r>
+              <w:rPr>
+                <w:rStyle w:val="QuelltextZeichen"/>
+              </w:rPr>
+              <w:t>andler</w:t>
+            </w:r>
+          </w:p>
+        </w:tc>
+        <w:tc>
+          <w:tcPr>
+            <w:tcW w:w="1289" w:type="dxa"/>
+          </w:tcPr>
+          <w:p>
+            <w:pPr>
+              <w:cnfStyle w:val="000000000000" w:firstRow="0" w:lastRow="0" w:firstColumn="0" w:lastColumn="0" w:oddVBand="0" w:evenVBand="0" w:oddHBand="0" w:evenHBand="0" w:firstRowFirstColumn="0" w:firstRowLastColumn="0" w:lastRowFirstColumn="0" w:lastRowLastColumn="0"/>
+            </w:pPr>
+            <w:r>
+              <w:t>function</w:t>
+            </w:r>
+          </w:p>
+        </w:tc>
+        <w:tc>
+          <w:tcPr>
+            <w:tcW w:w="1405" w:type="dxa"/>
+          </w:tcPr>
+          <w:p>
+            <w:pPr>
+              <w:cnfStyle w:val="000000000000" w:firstRow="0" w:lastRow="0" w:firstColumn="0" w:lastColumn="0" w:oddVBand="0" w:evenVBand="0" w:oddHBand="0" w:evenHBand="0" w:firstRowFirstColumn="0" w:firstRowLastColumn="0" w:lastRowFirstColumn="0" w:lastRowLastColumn="0"/>
+            </w:pPr>
+          </w:p>
+        </w:tc>
+        <w:tc>
+          <w:tcPr>
+            <w:tcW w:w="2033" w:type="dxa"/>
+          </w:tcPr>
+          <w:p>
+            <w:pPr>
+              <w:cnfStyle w:val="000000000000" w:firstRow="0" w:lastRow="0" w:firstColumn="0" w:lastColumn="0" w:oddVBand="0" w:evenVBand="0" w:oddHBand="0" w:evenHBand="0" w:firstRowFirstColumn="0" w:firstRowLastColumn="0" w:lastRowFirstColumn="0" w:lastRowLastColumn="0"/>
+            </w:pPr>
+            <w:r>
+              <w:t>The handler funtion</w:t>
+            </w:r>
+          </w:p>
+        </w:tc>
+      </w:tr>
+      <w:tr>
+        <w:trPr>
+          <w:cnfStyle w:val="000000100000" w:firstRow="0" w:lastRow="0" w:firstColumn="0" w:lastColumn="0" w:oddVBand="0" w:evenVBand="0" w:oddHBand="1" w:evenHBand="0" w:firstRowFirstColumn="0" w:firstRowLastColumn="0" w:lastRowFirstColumn="0" w:lastRowLastColumn="0"/>
+        </w:trPr>
+        <w:tc>
+          <w:tcPr>
+            <w:cnfStyle w:val="001000000000" w:firstRow="0" w:lastRow="0" w:firstColumn="1" w:lastColumn="0" w:oddVBand="0" w:evenVBand="0" w:oddHBand="0" w:evenHBand="0" w:firstRowFirstColumn="0" w:firstRowLastColumn="0" w:lastRowFirstColumn="0" w:lastRowLastColumn="0"/>
+            <w:tcW w:w="2346" w:type="dxa"/>
+            <w:gridSpan w:val="2"/>
+          </w:tcPr>
+          <w:p>
+            <w:pPr>
+              <w:rPr>
+                <w:rStyle w:val="QuelltextZeichen"/>
+              </w:rPr>
+            </w:pPr>
+            <w:r>
+              <w:rPr>
+                <w:rStyle w:val="QuelltextZeichen"/>
+              </w:rPr>
+              <w:t>O</w:t>
+            </w:r>
+            <w:r>
+              <w:rPr>
+                <w:rStyle w:val="QuelltextZeichen"/>
+              </w:rPr>
+              <w:t>ptions</w:t>
+            </w:r>
+          </w:p>
+        </w:tc>
+        <w:tc>
+          <w:tcPr>
+            <w:tcW w:w="1289" w:type="dxa"/>
+          </w:tcPr>
+          <w:p>
+            <w:pPr>
+              <w:cnfStyle w:val="000000100000" w:firstRow="0" w:lastRow="0" w:firstColumn="0" w:lastColumn="0" w:oddVBand="0" w:evenVBand="0" w:oddHBand="1" w:evenHBand="0" w:firstRowFirstColumn="0" w:firstRowLastColumn="0" w:lastRowFirstColumn="0" w:lastRowLastColumn="0"/>
+            </w:pPr>
+            <w:r>
+              <w:t>object</w:t>
+            </w:r>
+          </w:p>
+        </w:tc>
+        <w:tc>
+          <w:tcPr>
+            <w:tcW w:w="1405" w:type="dxa"/>
+          </w:tcPr>
+          <w:p>
+            <w:pPr>
+              <w:cnfStyle w:val="000000100000" w:firstRow="0" w:lastRow="0" w:firstColumn="0" w:lastColumn="0" w:oddVBand="0" w:evenVBand="0" w:oddHBand="1" w:evenHBand="0" w:firstRowFirstColumn="0" w:firstRowLastColumn="0" w:lastRowFirstColumn="0" w:lastRowLastColumn="0"/>
+            </w:pPr>
+            <w:r>
+              <w:t>Null</w:t>
+            </w:r>
+          </w:p>
+        </w:tc>
+        <w:tc>
+          <w:tcPr>
+            <w:tcW w:w="2033" w:type="dxa"/>
+          </w:tcPr>
+          <w:p>
+            <w:pPr>
+              <w:cnfStyle w:val="000000100000" w:firstRow="0" w:lastRow="0" w:firstColumn="0" w:lastColumn="0" w:oddVBand="0" w:evenVBand="0" w:oddHBand="1" w:evenHBand="0" w:firstRowFirstColumn="0" w:firstRowLastColumn="0" w:lastRowFirstColumn="0" w:lastRowLastColumn="0"/>
+            </w:pPr>
+          </w:p>
+        </w:tc>
+      </w:tr>
+      <w:tr>
+        <w:tc>
+          <w:tcPr>
+            <w:cnfStyle w:val="001000000000" w:firstRow="0" w:lastRow="0" w:firstColumn="1" w:lastColumn="0" w:oddVBand="0" w:evenVBand="0" w:oddHBand="0" w:evenHBand="0" w:firstRowFirstColumn="0" w:firstRowLastColumn="0" w:lastRowFirstColumn="0" w:lastRowLastColumn="0"/>
+            <w:tcW w:w="397" w:type="dxa"/>
+          </w:tcPr>
+          <w:p>
+            <w:pPr>
+              <w:rPr>
+                <w:rStyle w:val="QuelltextZeichen"/>
+              </w:rPr>
+            </w:pPr>
+          </w:p>
+        </w:tc>
+        <w:tc>
+          <w:tcPr>
+            <w:tcW w:w="1949" w:type="dxa"/>
+          </w:tcPr>
+          <w:p>
+            <w:pPr>
+              <w:cnfStyle w:val="000000000000" w:firstRow="0" w:lastRow="0" w:firstColumn="0" w:lastColumn="0" w:oddVBand="0" w:evenVBand="0" w:oddHBand="0" w:evenHBand="0" w:firstRowFirstColumn="0" w:firstRowLastColumn="0" w:lastRowFirstColumn="0" w:lastRowLastColumn="0"/>
+              <w:rPr>
+                <w:rStyle w:val="QuelltextZeichen"/>
+              </w:rPr>
+            </w:pPr>
+            <w:r>
+              <w:rPr>
+                <w:rStyle w:val="QuelltextZeichen"/>
+              </w:rPr>
+              <w:t>excludeFormFields</w:t>
+            </w:r>
+          </w:p>
+        </w:tc>
+        <w:tc>
+          <w:tcPr>
+            <w:tcW w:w="1289" w:type="dxa"/>
+          </w:tcPr>
+          <w:p>
+            <w:pPr>
+              <w:cnfStyle w:val="000000000000" w:firstRow="0" w:lastRow="0" w:firstColumn="0" w:lastColumn="0" w:oddVBand="0" w:evenVBand="0" w:oddHBand="0" w:evenHBand="0" w:firstRowFirstColumn="0" w:firstRowLastColumn="0" w:lastRowFirstColumn="0" w:lastRowLastColumn="0"/>
+            </w:pPr>
+            <w:r>
+              <w:t>boolean</w:t>
+            </w:r>
+          </w:p>
+        </w:tc>
+        <w:tc>
+          <w:tcPr>
+            <w:tcW w:w="1405" w:type="dxa"/>
+          </w:tcPr>
+          <w:p>
+            <w:pPr>
+              <w:cnfStyle w:val="000000000000" w:firstRow="0" w:lastRow="0" w:firstColumn="0" w:lastColumn="0" w:oddVBand="0" w:evenVBand="0" w:oddHBand="0" w:evenHBand="0" w:firstRowFirstColumn="0" w:firstRowLastColumn="0" w:lastRowFirstColumn="0" w:lastRowLastColumn="0"/>
+            </w:pPr>
+            <w:r>
+              <w:t>true</w:t>
+            </w:r>
+          </w:p>
+        </w:tc>
+        <w:tc>
+          <w:tcPr>
+            <w:tcW w:w="2033" w:type="dxa"/>
+          </w:tcPr>
+          <w:p>
+            <w:pPr>
+              <w:cnfStyle w:val="000000000000" w:firstRow="0" w:lastRow="0" w:firstColumn="0" w:lastColumn="0" w:oddVBand="0" w:evenVBand="0" w:oddHBand="0" w:evenHBand="0" w:firstRowFirstColumn="0" w:firstRowLastColumn="0" w:lastRowFirstColumn="0" w:lastRowLastColumn="0"/>
+            </w:pPr>
+            <w:r>
+              <w:t>Verhindert Key-Handling wenn der Fokus auf einem Formularfeld liegt</w:t>
+            </w:r>
+          </w:p>
+        </w:tc>
+      </w:tr>
+      <w:tr>
+        <w:trPr>
+          <w:cnfStyle w:val="000000100000" w:firstRow="0" w:lastRow="0" w:firstColumn="0" w:lastColumn="0" w:oddVBand="0" w:evenVBand="0" w:oddHBand="1" w:evenHBand="0" w:firstRowFirstColumn="0" w:firstRowLastColumn="0" w:lastRowFirstColumn="0" w:lastRowLastColumn="0"/>
+        </w:trPr>
+        <w:tc>
+          <w:tcPr>
+            <w:cnfStyle w:val="001000000000" w:firstRow="0" w:lastRow="0" w:firstColumn="1" w:lastColumn="0" w:oddVBand="0" w:evenVBand="0" w:oddHBand="0" w:evenHBand="0" w:firstRowFirstColumn="0" w:firstRowLastColumn="0" w:lastRowFirstColumn="0" w:lastRowLastColumn="0"/>
+            <w:tcW w:w="397" w:type="dxa"/>
+          </w:tcPr>
+          <w:p>
+            <w:pPr>
+              <w:rPr>
+                <w:rStyle w:val="QuelltextZeichen"/>
+              </w:rPr>
+            </w:pPr>
+          </w:p>
+        </w:tc>
+        <w:tc>
+          <w:tcPr>
+            <w:tcW w:w="1949" w:type="dxa"/>
+          </w:tcPr>
+          <w:p>
+            <w:pPr>
+              <w:cnfStyle w:val="000000100000" w:firstRow="0" w:lastRow="0" w:firstColumn="0" w:lastColumn="0" w:oddVBand="0" w:evenVBand="0" w:oddHBand="1" w:evenHBand="0" w:firstRowFirstColumn="0" w:firstRowLastColumn="0" w:lastRowFirstColumn="0" w:lastRowLastColumn="0"/>
+              <w:rPr>
+                <w:rStyle w:val="QuelltextZeichen"/>
+              </w:rPr>
+            </w:pPr>
+            <w:r>
+              <w:rPr>
+                <w:rStyle w:val="QuelltextZeichen"/>
+              </w:rPr>
+              <w:t>preventDefault</w:t>
+            </w:r>
+          </w:p>
+        </w:tc>
+        <w:tc>
+          <w:tcPr>
+            <w:tcW w:w="1289" w:type="dxa"/>
+          </w:tcPr>
+          <w:p>
+            <w:pPr>
+              <w:cnfStyle w:val="000000100000" w:firstRow="0" w:lastRow="0" w:firstColumn="0" w:lastColumn="0" w:oddVBand="0" w:evenVBand="0" w:oddHBand="1" w:evenHBand="0" w:firstRowFirstColumn="0" w:firstRowLastColumn="0" w:lastRowFirstColumn="0" w:lastRowLastColumn="0"/>
+            </w:pPr>
+            <w:r>
+              <w:t>b</w:t>
+            </w:r>
+            <w:r>
+              <w:t>oolean</w:t>
+            </w:r>
+          </w:p>
+        </w:tc>
+        <w:tc>
+          <w:tcPr>
+            <w:tcW w:w="1405" w:type="dxa"/>
+          </w:tcPr>
+          <w:p>
+            <w:pPr>
+              <w:cnfStyle w:val="000000100000" w:firstRow="0" w:lastRow="0" w:firstColumn="0" w:lastColumn="0" w:oddVBand="0" w:evenVBand="0" w:oddHBand="1" w:evenHBand="0" w:firstRowFirstColumn="0" w:firstRowLastColumn="0" w:lastRowFirstColumn="0" w:lastRowLastColumn="0"/>
+            </w:pPr>
+            <w:r>
+              <w:t>false</w:t>
+            </w:r>
+          </w:p>
+        </w:tc>
+        <w:tc>
+          <w:tcPr>
+            <w:tcW w:w="2033" w:type="dxa"/>
+          </w:tcPr>
+          <w:p>
+            <w:pPr>
+              <w:cnfStyle w:val="000000100000" w:firstRow="0" w:lastRow="0" w:firstColumn="0" w:lastColumn="0" w:oddVBand="0" w:evenVBand="0" w:oddHBand="1" w:evenHBand="0" w:firstRowFirstColumn="0" w:firstRowLastColumn="0" w:lastRowFirstColumn="0" w:lastRowLastColumn="0"/>
+            </w:pPr>
+          </w:p>
+        </w:tc>
+      </w:tr>
+      <w:tr>
+        <w:tc>
+          <w:tcPr>
+            <w:cnfStyle w:val="001000000000" w:firstRow="0" w:lastRow="0" w:firstColumn="1" w:lastColumn="0" w:oddVBand="0" w:evenVBand="0" w:oddHBand="0" w:evenHBand="0" w:firstRowFirstColumn="0" w:firstRowLastColumn="0" w:lastRowFirstColumn="0" w:lastRowLastColumn="0"/>
+            <w:tcW w:w="397" w:type="dxa"/>
+          </w:tcPr>
+          <w:p>
+            <w:pPr>
+              <w:rPr>
+                <w:rStyle w:val="QuelltextZeichen"/>
+              </w:rPr>
+            </w:pPr>
+          </w:p>
+        </w:tc>
+        <w:tc>
+          <w:tcPr>
+            <w:tcW w:w="1949" w:type="dxa"/>
+          </w:tcPr>
+          <w:p>
+            <w:pPr>
+              <w:cnfStyle w:val="000000000000" w:firstRow="0" w:lastRow="0" w:firstColumn="0" w:lastColumn="0" w:oddVBand="0" w:evenVBand="0" w:oddHBand="0" w:evenHBand="0" w:firstRowFirstColumn="0" w:firstRowLastColumn="0" w:lastRowFirstColumn="0" w:lastRowLastColumn="0"/>
+              <w:rPr>
+                <w:rStyle w:val="QuelltextZeichen"/>
+              </w:rPr>
+            </w:pPr>
+            <w:r>
+              <w:rPr>
+                <w:rStyle w:val="QuelltextZeichen"/>
+              </w:rPr>
+              <w:t>stopPropagation</w:t>
+            </w:r>
+          </w:p>
+        </w:tc>
+        <w:tc>
+          <w:tcPr>
+            <w:tcW w:w="1289" w:type="dxa"/>
+          </w:tcPr>
+          <w:p>
+            <w:pPr>
+              <w:cnfStyle w:val="000000000000" w:firstRow="0" w:lastRow="0" w:firstColumn="0" w:lastColumn="0" w:oddVBand="0" w:evenVBand="0" w:oddHBand="0" w:evenHBand="0" w:firstRowFirstColumn="0" w:firstRowLastColumn="0" w:lastRowFirstColumn="0" w:lastRowLastColumn="0"/>
+            </w:pPr>
+            <w:r>
+              <w:t>boolean</w:t>
+            </w:r>
+          </w:p>
+        </w:tc>
+        <w:tc>
+          <w:tcPr>
+            <w:tcW w:w="1405" w:type="dxa"/>
+          </w:tcPr>
+          <w:p>
+            <w:pPr>
+              <w:cnfStyle w:val="000000000000" w:firstRow="0" w:lastRow="0" w:firstColumn="0" w:lastColumn="0" w:oddVBand="0" w:evenVBand="0" w:oddHBand="0" w:evenHBand="0" w:firstRowFirstColumn="0" w:firstRowLastColumn="0" w:lastRowFirstColumn="0" w:lastRowLastColumn="0"/>
+            </w:pPr>
+            <w:r>
+              <w:t>false</w:t>
+            </w:r>
+          </w:p>
+        </w:tc>
+        <w:tc>
+          <w:tcPr>
+            <w:tcW w:w="2033" w:type="dxa"/>
+          </w:tcPr>
+          <w:p>
+            <w:pPr>
+              <w:cnfStyle w:val="000000000000" w:firstRow="0" w:lastRow="0" w:firstColumn="0" w:lastColumn="0" w:oddVBand="0" w:evenVBand="0" w:oddHBand="0" w:evenHBand="0" w:firstRowFirstColumn="0" w:firstRowLastColumn="0" w:lastRowFirstColumn="0" w:lastRowLastColumn="0"/>
+            </w:pPr>
+          </w:p>
+        </w:tc>
+      </w:tr>
+    </w:tbl>
     <w:p/>
     <w:p>
       <w:pPr>
         <w:pStyle w:val="berschrift2"/>
-      </w:pPr>
-      <w:r>
+        <w:rPr>
+          <w:lang w:val="en-US"/>
+        </w:rPr>
+      </w:pPr>
+      <w:r>
+        <w:rPr>
+          <w:lang w:val="en-US"/>
+        </w:rPr>
         <w:t>Mutation Handler</w:t>
       </w:r>
     </w:p>
     <w:p>
       <w:pPr>
         <w:pStyle w:val="berschrift3"/>
-      </w:pPr>
-      <w:r>
+        <w:rPr>
+          <w:lang w:val="en-US"/>
+        </w:rPr>
+      </w:pPr>
+      <w:r>
+        <w:rPr>
+          <w:lang w:val="en-US"/>
+        </w:rPr>
         <w:t>Registrieerung</w:t>
       </w:r>
     </w:p>
     <w:p>
       <w:pPr>
         <w:pStyle w:val="Quelltexteingerckt"/>
-      </w:pPr>
-      <w:r>
+        <w:rPr>
+          <w:lang w:val="en-US"/>
+        </w:rPr>
+      </w:pPr>
+      <w:r>
+        <w:rPr>
+          <w:lang w:val="en-US"/>
+        </w:rPr>
         <w:t>Window.onMutation</w:t>
       </w:r>
       <w:bookmarkStart w:id="0" w:name="_Hlk146221186"/>
       <w:r>
+        <w:rPr>
+          <w:lang w:val="en-US"/>
+        </w:rPr>
         <w:t>('selector',</w:t>
       </w:r>
       <w:r>
+        <w:rPr>
+          <w:lang w:val="en-US"/>
+        </w:rPr>
         <w:t xml:space="preserve"> </w:t>
       </w:r>
       <w:bookmarkEnd w:id="0"/>
       <w:r>
+        <w:rPr>
+          <w:lang w:val="en-US"/>
+        </w:rPr>
         <w:t>reaction</w:t>
       </w:r>
       <w:r>
+        <w:rPr>
+          <w:lang w:val="en-US"/>
+        </w:rPr>
         <w:t>)</w:t>
       </w:r>
       <w:r>
+        <w:rPr>
+          <w:lang w:val="en-US"/>
+        </w:rPr>
         <w:t>;</w:t>
       </w:r>
     </w:p>
@@ -3845,7 +4902,6 @@
           </w:tcPr>
           <w:p>
             <w:r>
-              <w:lastRenderedPageBreak/>
               <w:t>--neutral-button</w:t>
             </w:r>
           </w:p>
@@ -5018,35 +6074,35 @@
         <v:path o:extrusionok="f" gradientshapeok="t" o:connecttype="rect"/>
         <o:lock v:ext="edit" aspectratio="t"/>
       </v:shapetype>
-      <v:shape id="_x0000_i1051" type="#_x0000_t75" style="width:14.55pt;height:14.55pt;visibility:visible;mso-wrap-style:square" o:bullet="t">
+      <v:shape id="_x0000_i1025" type="#_x0000_t75" style="width:14.5pt;height:14.5pt;visibility:visible;mso-wrap-style:square" o:bullet="t">
         <v:imagedata r:id="rId1" o:title=""/>
       </v:shape>
     </w:pict>
   </w:numPicBullet>
   <w:numPicBullet w:numPicBulletId="1">
     <w:pict>
-      <v:shape id="_x0000_i1052" type="#_x0000_t75" style="width:11.45pt;height:11.45pt;visibility:visible;mso-wrap-style:square" o:bullet="t">
+      <v:shape id="_x0000_i1026" type="#_x0000_t75" style="width:11.4pt;height:11.4pt;visibility:visible;mso-wrap-style:square" o:bullet="t">
         <v:imagedata r:id="rId2" o:title=""/>
       </v:shape>
     </w:pict>
   </w:numPicBullet>
   <w:numPicBullet w:numPicBulletId="2">
     <w:pict>
-      <v:shape id="_x0000_i1053" type="#_x0000_t75" alt="Beschreibung: 120px-Crystal_Clear_action_info" style="width:14.55pt;height:14.55pt;visibility:visible;mso-wrap-style:square" o:bullet="t">
+      <v:shape id="_x0000_i1027" type="#_x0000_t75" alt="Beschreibung: 120px-Crystal_Clear_action_info" style="width:14.5pt;height:14.5pt;visibility:visible;mso-wrap-style:square" o:bullet="t">
         <v:imagedata r:id="rId3" o:title=" 120px-Crystal_Clear_action_info"/>
       </v:shape>
     </w:pict>
   </w:numPicBullet>
   <w:numPicBullet w:numPicBulletId="3">
     <w:pict>
-      <v:shape id="_x0000_i1054" type="#_x0000_t75" alt="Beschreibung: 120px-Nuvola_apps_important" style="width:90pt;height:75.15pt;visibility:visible;mso-wrap-style:square" o:bullet="t">
+      <v:shape id="_x0000_i1028" type="#_x0000_t75" alt="Beschreibung: 120px-Nuvola_apps_important" style="width:90pt;height:75.1pt;visibility:visible;mso-wrap-style:square" o:bullet="t">
         <v:imagedata r:id="rId4" o:title=" 120px-Nuvola_apps_important"/>
       </v:shape>
     </w:pict>
   </w:numPicBullet>
   <w:numPicBullet w:numPicBulletId="4">
     <w:pict>
-      <v:shape id="_x0000_i1055" type="#_x0000_t75" alt="Beschreibung: 120px-Crystal_Clear_app_ktip" style="width:14.55pt;height:14.55pt;visibility:visible;mso-wrap-style:square" o:bullet="t">
+      <v:shape id="_x0000_i1029" type="#_x0000_t75" alt="Beschreibung: 120px-Crystal_Clear_app_ktip" style="width:14.5pt;height:14.5pt;visibility:visible;mso-wrap-style:square" o:bullet="t">
         <v:imagedata r:id="rId5" o:title=" 120px-Crystal_Clear_app_ktip"/>
       </v:shape>
     </w:pict>

</xml_diff>